<commit_message>
added posts and reworked nav path
can't wait to revisit nav path like 2 days later, cuz it's ass again
</commit_message>
<xml_diff>
--- a/docs/Script.docx
+++ b/docs/Script.docx
@@ -1549,6 +1549,7 @@
         </w:numPr>
       </w:pPr>
       <w:r>
+        <w:lastRenderedPageBreak/>
         <w:t>Social network</w:t>
       </w:r>
       <w:r>
@@ -1684,7 +1685,6 @@
       <w:bookmarkStart w:id="4" w:name="_Toc216793240"/>
       <w:bookmarkEnd w:id="3"/>
       <w:r>
-        <w:lastRenderedPageBreak/>
         <w:t>Characters</w:t>
       </w:r>
       <w:r>
@@ -2013,6 +2013,7 @@
         </w:numPr>
       </w:pPr>
       <w:r>
+        <w:lastRenderedPageBreak/>
         <w:t>Gamer</w:t>
       </w:r>
     </w:p>
@@ -2365,6 +2366,7 @@
         </w:numPr>
       </w:pPr>
       <w:r>
+        <w:lastRenderedPageBreak/>
         <w:t xml:space="preserve">As he snaps out of </w:t>
       </w:r>
       <w:r>
@@ -2773,6 +2775,7 @@
         </w:numPr>
       </w:pPr>
       <w:r>
+        <w:lastRenderedPageBreak/>
         <w:t>Traits</w:t>
       </w:r>
     </w:p>
@@ -3274,6 +3277,7 @@
         </w:numPr>
       </w:pPr>
       <w:r>
+        <w:lastRenderedPageBreak/>
         <w:t xml:space="preserve">They have beef with </w:t>
       </w:r>
       <w:r>
@@ -3646,7 +3650,11 @@
         <w:t>game’s single player</w:t>
       </w:r>
       <w:r>
-        <w:t>, this sub is a lot more peaceful and wholesome. People here share some tips about completing the game, story discussions and memes.</w:t>
+        <w:t xml:space="preserve">, this sub is a lot more peaceful and wholesome. People </w:t>
+      </w:r>
+      <w:r>
+        <w:lastRenderedPageBreak/>
+        <w:t>here share some tips about completing the game, story discussions and memes.</w:t>
       </w:r>
     </w:p>
     <w:p>
@@ -3958,6 +3966,7 @@
         <w:t xml:space="preserve"> it and how many hours he’s got. He shows his stats on the profile, but it has long streak of </w:t>
       </w:r>
       <w:r>
+        <w:lastRenderedPageBreak/>
         <w:t xml:space="preserve">failed </w:t>
       </w:r>
       <w:proofErr w:type="spellStart"/>
@@ -4402,7 +4411,11 @@
         <w:t>the delete button is</w:t>
       </w:r>
       <w:r>
-        <w:t xml:space="preserve">. But then </w:t>
+        <w:t xml:space="preserve">. </w:t>
+      </w:r>
+      <w:r>
+        <w:lastRenderedPageBreak/>
+        <w:t xml:space="preserve">But then </w:t>
       </w:r>
       <w:proofErr w:type="gramStart"/>
       <w:r>
@@ -4767,6 +4780,7 @@
     </w:p>
     <w:p>
       <w:r>
+        <w:lastRenderedPageBreak/>
         <w:t xml:space="preserve">Hi. I am </w:t>
       </w:r>
       <w:proofErr w:type="spellStart"/>
@@ -4843,7 +4857,10 @@
       </w:r>
       <w:proofErr w:type="spellEnd"/>
       <w:r>
-        <w:t xml:space="preserve">, I have more than 1000 hours and, boy, </w:t>
+        <w:t>.</w:t>
+      </w:r>
+      <w:r>
+        <w:t xml:space="preserve"> I have more than 1000 hours and, boy, </w:t>
       </w:r>
       <w:proofErr w:type="spellStart"/>
       <w:r>
@@ -5113,75 +5130,538 @@
     </w:p>
     <w:p>
       <w:r>
+        <w:t xml:space="preserve">(User is prompted to go to the chat page and </w:t>
+      </w:r>
+      <w:r>
+        <w:t>type in it</w:t>
+      </w:r>
+      <w:r>
+        <w:t>)</w:t>
+      </w:r>
+    </w:p>
+    <w:p>
+      <w:r>
+        <w:t>(Previous messages)</w:t>
+      </w:r>
+    </w:p>
+    <w:p>
+      <w:r>
+        <w:t>User 1: bro th</w:t>
+      </w:r>
+      <w:r>
+        <w:t>e</w:t>
+      </w:r>
+      <w:r>
+        <w:t>s</w:t>
+      </w:r>
+      <w:r>
+        <w:t>e</w:t>
+      </w:r>
+      <w:r>
+        <w:t xml:space="preserve"> </w:t>
+      </w:r>
+      <w:proofErr w:type="spellStart"/>
+      <w:r>
+        <w:t>clankers</w:t>
+      </w:r>
+      <w:proofErr w:type="spellEnd"/>
+      <w:r>
+        <w:t xml:space="preserve"> spawn rate is insane, how </w:t>
+      </w:r>
+      <w:proofErr w:type="spellStart"/>
+      <w:r>
+        <w:t>tf</w:t>
+      </w:r>
+      <w:proofErr w:type="spellEnd"/>
+      <w:r>
+        <w:t xml:space="preserve"> r u supposed to fight them on d10</w:t>
+      </w:r>
+    </w:p>
+    <w:p>
+      <w:r>
+        <w:t xml:space="preserve">User 2: skill issue </w:t>
+      </w:r>
+      <w:proofErr w:type="spellStart"/>
+      <w:r>
+        <w:t>bruh</w:t>
+      </w:r>
+      <w:proofErr w:type="spellEnd"/>
+    </w:p>
+    <w:p>
+      <w:r>
+        <w:t>User 1: blow me</w:t>
+      </w:r>
+    </w:p>
+    <w:p>
+      <w:r>
         <w:lastRenderedPageBreak/>
-        <w:t xml:space="preserve">(User is prompted to go to the chat page and </w:t>
-      </w:r>
-      <w:r>
-        <w:t>type in it</w:t>
-      </w:r>
-      <w:r>
-        <w:t>)</w:t>
-      </w:r>
-    </w:p>
-    <w:p>
-      <w:r>
-        <w:t>(Previous messages)</w:t>
-      </w:r>
-    </w:p>
-    <w:p>
-      <w:r>
-        <w:t>User 1: bro th</w:t>
-      </w:r>
-      <w:r>
-        <w:t>e</w:t>
-      </w:r>
-      <w:r>
-        <w:t>s</w:t>
-      </w:r>
-      <w:r>
-        <w:t>e</w:t>
+        <w:t xml:space="preserve">User 3: </w:t>
+      </w:r>
+      <w:r>
+        <w:t xml:space="preserve">just bring </w:t>
+      </w:r>
+      <w:proofErr w:type="spellStart"/>
+      <w:r>
+        <w:t>ak</w:t>
+      </w:r>
+      <w:proofErr w:type="spellEnd"/>
+      <w:r>
+        <w:t xml:space="preserve"> 4.7.0 with reactive boost, it’s not that hard</w:t>
+      </w:r>
+    </w:p>
+    <w:p>
+      <w:r>
+        <w:t>User 1: damn bro, u so smart, why didn’t I think of that</w:t>
+      </w:r>
+    </w:p>
+    <w:p>
+      <w:r>
+        <w:t xml:space="preserve">User 1: I need level 75 to unlock </w:t>
+      </w:r>
+      <w:proofErr w:type="spellStart"/>
+      <w:r>
+        <w:t>ak</w:t>
+      </w:r>
+      <w:proofErr w:type="spellEnd"/>
+      <w:r>
+        <w:t xml:space="preserve"> 4.7.0, </w:t>
+      </w:r>
+      <w:proofErr w:type="spellStart"/>
+      <w:r>
+        <w:t>im</w:t>
+      </w:r>
+      <w:proofErr w:type="spellEnd"/>
+      <w:r>
+        <w:t xml:space="preserve"> like 42</w:t>
+      </w:r>
+    </w:p>
+    <w:p>
+      <w:r>
+        <w:t xml:space="preserve">User 3: </w:t>
+      </w:r>
+      <w:proofErr w:type="gramStart"/>
+      <w:r>
+        <w:t>well</w:t>
+      </w:r>
+      <w:proofErr w:type="gramEnd"/>
+      <w:r>
+        <w:t xml:space="preserve"> idk, don’t play ai faction then, or lower the diff if u can’t take the heat</w:t>
+      </w:r>
+    </w:p>
+    <w:p>
+      <w:r>
+        <w:t>User 1: spearhead needs to nerf this fucking spawn rate</w:t>
+      </w:r>
+      <w:r>
+        <w:t>, fucking ruining this game</w:t>
+      </w:r>
+    </w:p>
+    <w:p>
+      <w:r>
+        <w:t>User 4: nah u kidding ai d10 is way too easy, if anything, they need to make it harder</w:t>
+      </w:r>
+    </w:p>
+    <w:p>
+      <w:r>
+        <w:t xml:space="preserve">User 4: go train on d1 </w:t>
+      </w:r>
+      <w:proofErr w:type="spellStart"/>
+      <w:r>
+        <w:t>bruh</w:t>
+      </w:r>
+      <w:proofErr w:type="spellEnd"/>
+      <w:r>
+        <w:t>, left mouse button to shoot btw</w:t>
+      </w:r>
+    </w:p>
+    <w:p>
+      <w:r>
+        <w:t xml:space="preserve">User 1: go touch some grass </w:t>
+      </w:r>
+      <w:proofErr w:type="spellStart"/>
+      <w:r>
+        <w:t>bruh</w:t>
+      </w:r>
+      <w:proofErr w:type="spellEnd"/>
+      <w:r>
+        <w:t xml:space="preserve">, </w:t>
+      </w:r>
+      <w:proofErr w:type="spellStart"/>
+      <w:r>
+        <w:t>ur</w:t>
+      </w:r>
+      <w:proofErr w:type="spellEnd"/>
+      <w:r>
+        <w:t xml:space="preserve"> father won’t come back home if u put another 100 hours in the game</w:t>
+      </w:r>
+    </w:p>
+    <w:p>
+      <w:proofErr w:type="spellStart"/>
+      <w:r>
+        <w:t>Main_hero</w:t>
+      </w:r>
+      <w:proofErr w:type="spellEnd"/>
+      <w:r>
+        <w:t xml:space="preserve">: </w:t>
+      </w:r>
+      <w:proofErr w:type="spellStart"/>
+      <w:r>
+        <w:t>yo</w:t>
+      </w:r>
+      <w:proofErr w:type="spellEnd"/>
+    </w:p>
+    <w:p>
+      <w:r>
+        <w:t>User 1: bro it’s this mf again</w:t>
+      </w:r>
+    </w:p>
+    <w:p>
+      <w:r>
+        <w:t xml:space="preserve">User 2: u dumb fuck, we lost a </w:t>
+      </w:r>
+      <w:r>
+        <w:t>sprint</w:t>
       </w:r>
       <w:r>
         <w:t xml:space="preserve"> </w:t>
       </w:r>
       <w:proofErr w:type="spellStart"/>
       <w:r>
-        <w:t>clankers</w:t>
-      </w:r>
-      <w:proofErr w:type="spellEnd"/>
-      <w:r>
-        <w:t xml:space="preserve"> spawn rate is insane, how </w:t>
-      </w:r>
-      <w:proofErr w:type="spellStart"/>
-      <w:r>
-        <w:t>tf</w:t>
-      </w:r>
-      <w:proofErr w:type="spellEnd"/>
-      <w:r>
-        <w:t xml:space="preserve"> r u supposed to fight them on d10</w:t>
-      </w:r>
-    </w:p>
-    <w:p>
-      <w:r>
-        <w:t xml:space="preserve">User 2: skill issue </w:t>
+        <w:t>cuz</w:t>
+      </w:r>
+      <w:proofErr w:type="spellEnd"/>
+      <w:r>
+        <w:t xml:space="preserve"> of u</w:t>
+      </w:r>
+    </w:p>
+    <w:p>
+      <w:r>
+        <w:t>User 3: did u finally learn how to play?</w:t>
+      </w:r>
+    </w:p>
+    <w:p>
+      <w:r>
+        <w:t>(Screen is getting red)</w:t>
+      </w:r>
+    </w:p>
+    <w:p>
+      <w:r>
+        <w:t xml:space="preserve">User 4: go fuck </w:t>
+      </w:r>
+      <w:proofErr w:type="spellStart"/>
+      <w:r>
+        <w:t>urself</w:t>
+      </w:r>
+      <w:proofErr w:type="spellEnd"/>
+      <w:r>
+        <w:t xml:space="preserve">, </w:t>
+      </w:r>
+      <w:r>
+        <w:t>u killed me like 10 times</w:t>
+      </w:r>
+      <w:r>
+        <w:t>, cunt</w:t>
+      </w:r>
+    </w:p>
+    <w:p>
+      <w:r>
+        <w:t xml:space="preserve">User 5: </w:t>
+      </w:r>
+      <w:r>
+        <w:t xml:space="preserve">mf is acting like nothing happened, </w:t>
+      </w:r>
+      <w:r>
+        <w:t xml:space="preserve">go fuck </w:t>
+      </w:r>
+      <w:proofErr w:type="spellStart"/>
+      <w:r>
+        <w:t>urself</w:t>
+      </w:r>
+      <w:proofErr w:type="spellEnd"/>
+    </w:p>
+    <w:p>
+      <w:r>
+        <w:t xml:space="preserve">User 6: bro that last </w:t>
+      </w:r>
+      <w:r>
+        <w:t>sprint</w:t>
+      </w:r>
+      <w:r>
+        <w:t xml:space="preserve"> was painful to watch, </w:t>
+      </w:r>
+      <w:r>
+        <w:t>u brought like the worst guns for bugs</w:t>
+      </w:r>
+      <w:r>
+        <w:t>, shit wasn’t even close</w:t>
+      </w:r>
+      <w:r>
+        <w:t xml:space="preserve"> lmao</w:t>
+      </w:r>
+    </w:p>
+    <w:p>
+      <w:r>
+        <w:t xml:space="preserve">User 7: bro </w:t>
+      </w:r>
+      <w:r>
+        <w:t>was speedrunning the sprint failure</w:t>
+      </w:r>
+    </w:p>
+    <w:p>
+      <w:r>
+        <w:t xml:space="preserve">User 8: this noob ass was bragging about his skill so much and couldn’t even </w:t>
+      </w:r>
+      <w:r>
+        <w:t xml:space="preserve">clear a squid repository, </w:t>
+      </w:r>
+      <w:proofErr w:type="spellStart"/>
+      <w:r>
+        <w:t>bruuuh</w:t>
+      </w:r>
+      <w:proofErr w:type="spellEnd"/>
+    </w:p>
+    <w:p>
+      <w:r>
+        <w:t xml:space="preserve">User 9: secondhand embarrassment from watching u play was insane, I’d </w:t>
+      </w:r>
+      <w:proofErr w:type="gramStart"/>
+      <w:r>
+        <w:t>actually kms</w:t>
+      </w:r>
+      <w:proofErr w:type="gramEnd"/>
+      <w:r>
+        <w:t xml:space="preserve"> if I were you</w:t>
+      </w:r>
+    </w:p>
+    <w:p>
+      <w:r>
+        <w:t>User 10: that’s crazy lmao</w:t>
+      </w:r>
+    </w:p>
+    <w:p>
+      <w:r>
+        <w:t xml:space="preserve">They love me. I know it looks like they are </w:t>
+      </w:r>
+      <w:r>
+        <w:t>bullying</w:t>
+      </w:r>
+      <w:r>
+        <w:t xml:space="preserve"> me and calling me bad at the game or something</w:t>
+      </w:r>
+      <w:r>
+        <w:t xml:space="preserve">, but it’s </w:t>
+      </w:r>
+      <w:proofErr w:type="gramStart"/>
+      <w:r>
+        <w:t xml:space="preserve">actually </w:t>
+      </w:r>
+      <w:r>
+        <w:t>fine</w:t>
+      </w:r>
+      <w:proofErr w:type="gramEnd"/>
+      <w:r>
+        <w:t>, you just don’t get it</w:t>
+      </w:r>
+      <w:r>
+        <w:t xml:space="preserve">. It’s how we show </w:t>
+      </w:r>
+      <w:r>
+        <w:t>love</w:t>
+      </w:r>
+      <w:r>
+        <w:t xml:space="preserve"> and respect for each other, just friendly roasting. They know I’m good</w:t>
+      </w:r>
+      <w:r>
+        <w:t xml:space="preserve"> at the game</w:t>
+      </w:r>
+      <w:r>
+        <w:t>, they are just fucking with me.</w:t>
+      </w:r>
+    </w:p>
+    <w:p>
+      <w:r>
+        <w:lastRenderedPageBreak/>
+        <w:t xml:space="preserve">User 9: </w:t>
+      </w:r>
+      <w:proofErr w:type="spellStart"/>
+      <w:r>
+        <w:t>ain’t</w:t>
+      </w:r>
+      <w:proofErr w:type="spellEnd"/>
+      <w:r>
+        <w:t xml:space="preserve"> no one f</w:t>
+      </w:r>
+      <w:r>
+        <w:t xml:space="preserve">ucking </w:t>
+      </w:r>
+      <w:r>
+        <w:t>w</w:t>
+      </w:r>
+      <w:r>
+        <w:t>ith</w:t>
+      </w:r>
+      <w:r>
+        <w:t xml:space="preserve"> this dude, </w:t>
+      </w:r>
+      <w:r>
+        <w:t>kick</w:t>
+      </w:r>
+      <w:r>
+        <w:t xml:space="preserve"> his ass out of here</w:t>
+      </w:r>
+    </w:p>
+    <w:p>
+      <w:r>
+        <w:t>It’s all jokes, trust me.</w:t>
+      </w:r>
+    </w:p>
+    <w:p>
+      <w:pPr>
+        <w:pStyle w:val="Heading3"/>
+      </w:pPr>
+      <w:bookmarkStart w:id="18" w:name="_Toc216793254"/>
+      <w:r>
+        <w:t>Chance to prove yourself</w:t>
+      </w:r>
+      <w:bookmarkEnd w:id="18"/>
+    </w:p>
+    <w:p>
+      <w:r>
+        <w:t>(Screen goes back to normal)</w:t>
+      </w:r>
+    </w:p>
+    <w:p>
+      <w:r>
+        <w:t xml:space="preserve">User 10: </w:t>
+      </w:r>
+      <w:proofErr w:type="spellStart"/>
+      <w:r>
+        <w:t>yo</w:t>
+      </w:r>
+      <w:proofErr w:type="spellEnd"/>
+      <w:r>
+        <w:t xml:space="preserve">, y’all seen the news about delayed </w:t>
+      </w:r>
+      <w:r>
+        <w:t>zero</w:t>
+      </w:r>
+      <w:r>
+        <w:t xml:space="preserve"> </w:t>
+      </w:r>
+      <w:proofErr w:type="spellStart"/>
+      <w:r>
+        <w:t>dlc</w:t>
+      </w:r>
+      <w:proofErr w:type="spellEnd"/>
+      <w:r>
+        <w:t>?</w:t>
+      </w:r>
+    </w:p>
+    <w:p>
+      <w:r>
+        <w:t xml:space="preserve">User 2: yeah, </w:t>
+      </w:r>
+      <w:r>
+        <w:t>Spearhead</w:t>
+      </w:r>
+      <w:r>
+        <w:t xml:space="preserve"> can’t make the new content even for </w:t>
+      </w:r>
+      <w:r>
+        <w:t>zero</w:t>
+      </w:r>
+      <w:r>
+        <w:t xml:space="preserve"> lol</w:t>
+      </w:r>
+    </w:p>
+    <w:p>
+      <w:r>
+        <w:t xml:space="preserve">User 3: Zero the game? More like zero </w:t>
+      </w:r>
+      <w:proofErr w:type="spellStart"/>
+      <w:r>
+        <w:t>dlc</w:t>
+      </w:r>
+      <w:proofErr w:type="spellEnd"/>
+    </w:p>
+    <w:p>
+      <w:r>
+        <w:t>User 4: I will pay u not to joke ever again</w:t>
+      </w:r>
+    </w:p>
+    <w:p>
+      <w:r>
+        <w:t xml:space="preserve">User 5: holy cornball </w:t>
+      </w:r>
+    </w:p>
+    <w:p>
+      <w:r>
+        <w:t xml:space="preserve">User 6: fuck yeah, at least that means that finally </w:t>
+      </w:r>
+      <w:r>
+        <w:t>spearhead</w:t>
+      </w:r>
+      <w:r>
+        <w:t xml:space="preserve"> heard us and making </w:t>
+      </w:r>
+      <w:proofErr w:type="spellStart"/>
+      <w:r>
+        <w:t>smth</w:t>
+      </w:r>
+      <w:proofErr w:type="spellEnd"/>
+      <w:r>
+        <w:t xml:space="preserve"> new for </w:t>
+      </w:r>
+      <w:proofErr w:type="spellStart"/>
+      <w:r>
+        <w:t>cyberdivers</w:t>
+      </w:r>
+      <w:proofErr w:type="spellEnd"/>
+    </w:p>
+    <w:p>
+      <w:r>
+        <w:t xml:space="preserve">User 7: this absolutely does not mean that </w:t>
       </w:r>
       <w:proofErr w:type="spellStart"/>
       <w:r>
         <w:t>bruh</w:t>
       </w:r>
       <w:proofErr w:type="spellEnd"/>
-    </w:p>
-    <w:p>
-      <w:r>
-        <w:t>User 1: blow me</w:t>
-      </w:r>
-    </w:p>
-    <w:p>
-      <w:r>
-        <w:t xml:space="preserve">User 3: </w:t>
-      </w:r>
-      <w:r>
-        <w:t xml:space="preserve">just bring </w:t>
+      <w:r>
+        <w:t>, they just can’t do shit</w:t>
+      </w:r>
+    </w:p>
+    <w:p>
+      <w:r>
+        <w:t xml:space="preserve">User 12: </w:t>
+      </w:r>
+      <w:r>
+        <w:t>zero</w:t>
+      </w:r>
+      <w:r>
+        <w:t xml:space="preserve"> </w:t>
+      </w:r>
+      <w:r>
+        <w:t xml:space="preserve">fans </w:t>
+      </w:r>
+      <w:r>
+        <w:t xml:space="preserve">are in shambles </w:t>
+      </w:r>
+      <w:proofErr w:type="spellStart"/>
+      <w:r>
+        <w:t>rn</w:t>
+      </w:r>
+      <w:proofErr w:type="spellEnd"/>
+    </w:p>
+    <w:p>
+      <w:r>
+        <w:t>User 8: maybe we will finally get a</w:t>
+      </w:r>
+      <w:r>
+        <w:t>n</w:t>
+      </w:r>
+      <w:r>
+        <w:t xml:space="preserve"> </w:t>
       </w:r>
       <w:proofErr w:type="spellStart"/>
       <w:r>
@@ -5189,17 +5669,12 @@
       </w:r>
       <w:proofErr w:type="spellEnd"/>
       <w:r>
-        <w:t xml:space="preserve"> 4.7.0 with reactive boost, it’s not that hard</w:t>
-      </w:r>
-    </w:p>
-    <w:p>
-      <w:r>
-        <w:t>User 1: damn bro, u so smart, why didn’t I think of that</w:t>
-      </w:r>
-    </w:p>
-    <w:p>
-      <w:r>
-        <w:t xml:space="preserve">User 1: I need level 75 to unlock </w:t>
+        <w:t xml:space="preserve"> 4.7.0 buff</w:t>
+      </w:r>
+    </w:p>
+    <w:p>
+      <w:r>
+        <w:t xml:space="preserve">User 11: </w:t>
       </w:r>
       <w:proofErr w:type="spellStart"/>
       <w:r>
@@ -5207,581 +5682,123 @@
       </w:r>
       <w:proofErr w:type="spellEnd"/>
       <w:r>
-        <w:t xml:space="preserve"> 4.7.0, </w:t>
-      </w:r>
-      <w:proofErr w:type="spellStart"/>
-      <w:r>
-        <w:t>im</w:t>
-      </w:r>
-      <w:proofErr w:type="spellEnd"/>
-      <w:r>
-        <w:t xml:space="preserve"> like 42</w:t>
-      </w:r>
-    </w:p>
-    <w:p>
-      <w:r>
-        <w:t xml:space="preserve">User 3: </w:t>
+        <w:t xml:space="preserve"> 4.7.0 is already op</w:t>
+      </w:r>
+      <w:r>
+        <w:t xml:space="preserve">, u </w:t>
+      </w:r>
+      <w:r>
+        <w:t>just don’t know how to play with it</w:t>
+      </w:r>
+      <w:r>
+        <w:t xml:space="preserve">, I can easily </w:t>
+      </w:r>
+      <w:r>
+        <w:t xml:space="preserve">clear </w:t>
       </w:r>
       <w:proofErr w:type="gramStart"/>
       <w:r>
-        <w:t>well</w:t>
+        <w:t>bugs source</w:t>
       </w:r>
       <w:proofErr w:type="gramEnd"/>
       <w:r>
-        <w:t xml:space="preserve"> idk, don’t play ai faction then, or lower the diff if u can’t take the heat</w:t>
-      </w:r>
-    </w:p>
-    <w:p>
-      <w:r>
-        <w:t>User 1: spearhead needs to nerf this fucking spawn rate</w:t>
-      </w:r>
-      <w:r>
-        <w:t>, fucking ruining this game</w:t>
-      </w:r>
-    </w:p>
-    <w:p>
-      <w:r>
-        <w:t>User 4: nah u kidding ai d10 is way too easy, if anything, they need to make it harder</w:t>
-      </w:r>
-    </w:p>
-    <w:p>
-      <w:r>
-        <w:t xml:space="preserve">User 4: go train on d1 </w:t>
-      </w:r>
-      <w:proofErr w:type="spellStart"/>
-      <w:r>
-        <w:t>bruh</w:t>
-      </w:r>
-      <w:proofErr w:type="spellEnd"/>
-      <w:r>
-        <w:t>, left mouse button to shoot btw</w:t>
-      </w:r>
-    </w:p>
-    <w:p>
-      <w:r>
-        <w:t xml:space="preserve">User 1: go touch some grass </w:t>
-      </w:r>
-      <w:proofErr w:type="spellStart"/>
-      <w:r>
-        <w:t>bruh</w:t>
-      </w:r>
-      <w:proofErr w:type="spellEnd"/>
+        <w:t xml:space="preserve"> solo with it, maybe with vibe strike stratagem.</w:t>
+      </w:r>
+    </w:p>
+    <w:p>
+      <w:r>
+        <w:t xml:space="preserve">User 9: </w:t>
+      </w:r>
+      <w:r>
+        <w:t xml:space="preserve">vibe strike </w:t>
+      </w:r>
+      <w:proofErr w:type="gramStart"/>
+      <w:r>
+        <w:t>set’s</w:t>
+      </w:r>
+      <w:proofErr w:type="gramEnd"/>
+      <w:r>
+        <w:t xml:space="preserve"> </w:t>
+      </w:r>
+      <w:proofErr w:type="spellStart"/>
+      <w:r>
+        <w:t>ur</w:t>
+      </w:r>
+      <w:proofErr w:type="spellEnd"/>
+      <w:r>
+        <w:t xml:space="preserve"> teammates on fire, it’s the worst stratagem in the game</w:t>
+      </w:r>
       <w:r>
         <w:t xml:space="preserve">, </w:t>
       </w:r>
-      <w:proofErr w:type="spellStart"/>
-      <w:r>
-        <w:t>ur</w:t>
-      </w:r>
-      <w:proofErr w:type="spellEnd"/>
-      <w:r>
-        <w:t xml:space="preserve"> father won’t come back home if u put another 100 hours in the game</w:t>
-      </w:r>
-    </w:p>
-    <w:p>
-      <w:proofErr w:type="spellStart"/>
-      <w:r>
-        <w:t>Main_hero</w:t>
-      </w:r>
-      <w:proofErr w:type="spellEnd"/>
-      <w:r>
-        <w:t xml:space="preserve">: </w:t>
-      </w:r>
-      <w:proofErr w:type="spellStart"/>
-      <w:r>
-        <w:t>yo</w:t>
-      </w:r>
-      <w:proofErr w:type="spellEnd"/>
-    </w:p>
-    <w:p>
-      <w:r>
-        <w:t>User 1: bro it’s this mf again</w:t>
-      </w:r>
-    </w:p>
-    <w:p>
-      <w:r>
-        <w:t xml:space="preserve">User 2: u dumb fuck, we lost a </w:t>
-      </w:r>
-      <w:r>
-        <w:t>sprint</w:t>
-      </w:r>
+      <w:r>
+        <w:t>unless u r retarded ofc</w:t>
+      </w:r>
+    </w:p>
+    <w:p>
+      <w:r>
+        <w:t xml:space="preserve">Ah yes, </w:t>
+      </w:r>
+      <w:r>
+        <w:t>Zero</w:t>
+      </w:r>
+      <w:r>
+        <w:t>. Made by the same developer, Sp</w:t>
+      </w:r>
+      <w:r>
+        <w:t>earhead Studios</w:t>
+      </w:r>
+      <w:r>
+        <w:t xml:space="preserve">, as </w:t>
+      </w:r>
+      <w:r>
+        <w:t>our game</w:t>
+      </w:r>
+      <w:r>
+        <w:t>. Instead of making content and patches</w:t>
+      </w:r>
+      <w:r>
+        <w:t xml:space="preserve"> for </w:t>
+      </w:r>
+      <w:proofErr w:type="spellStart"/>
+      <w:r>
+        <w:t>Cyberdivers</w:t>
+      </w:r>
+      <w:proofErr w:type="spellEnd"/>
+      <w:r>
+        <w:t>, they decided to make some random ass</w:t>
+      </w:r>
+      <w:r>
+        <w:t xml:space="preserve"> spin-off</w:t>
+      </w:r>
+      <w:r>
+        <w:t>,</w:t>
+      </w:r>
+      <w:r>
+        <w:t xml:space="preserve"> and the game wasn’t even that good.</w:t>
+      </w:r>
+      <w:r>
+        <w:t xml:space="preserve"> And now they are working on the </w:t>
+      </w:r>
+      <w:proofErr w:type="spellStart"/>
+      <w:r>
+        <w:t>dlc</w:t>
+      </w:r>
+      <w:proofErr w:type="spellEnd"/>
+      <w:r>
+        <w:t xml:space="preserve"> for it</w:t>
+      </w:r>
+      <w:r>
+        <w:t xml:space="preserve">, while </w:t>
+      </w:r>
+      <w:proofErr w:type="spellStart"/>
+      <w:r>
+        <w:t>cyberdivers</w:t>
+      </w:r>
+      <w:proofErr w:type="spellEnd"/>
       <w:r>
         <w:t xml:space="preserve"> </w:t>
       </w:r>
-      <w:proofErr w:type="spellStart"/>
-      <w:r>
-        <w:t>cuz</w:t>
-      </w:r>
-      <w:proofErr w:type="spellEnd"/>
-      <w:r>
-        <w:t xml:space="preserve"> of u</w:t>
-      </w:r>
-    </w:p>
-    <w:p>
-      <w:r>
-        <w:t>User 3: did u finally learn how to play?</w:t>
-      </w:r>
-    </w:p>
-    <w:p>
-      <w:r>
-        <w:t>(Screen is getting red)</w:t>
-      </w:r>
-    </w:p>
-    <w:p>
-      <w:r>
-        <w:t xml:space="preserve">User 4: go fuck </w:t>
-      </w:r>
-      <w:proofErr w:type="spellStart"/>
-      <w:r>
-        <w:t>urself</w:t>
-      </w:r>
-      <w:proofErr w:type="spellEnd"/>
-      <w:r>
-        <w:t xml:space="preserve">, </w:t>
-      </w:r>
-      <w:r>
-        <w:t>u killed me like 10 times</w:t>
-      </w:r>
-      <w:r>
-        <w:t>, cunt</w:t>
-      </w:r>
-    </w:p>
-    <w:p>
-      <w:r>
-        <w:t xml:space="preserve">User 5: </w:t>
-      </w:r>
-      <w:r>
-        <w:t xml:space="preserve">mf is acting like nothing happened, </w:t>
-      </w:r>
-      <w:r>
-        <w:t xml:space="preserve">go fuck </w:t>
-      </w:r>
-      <w:proofErr w:type="spellStart"/>
-      <w:r>
-        <w:t>urself</w:t>
-      </w:r>
-      <w:proofErr w:type="spellEnd"/>
-    </w:p>
-    <w:p>
-      <w:r>
-        <w:t xml:space="preserve">User 6: bro that last </w:t>
-      </w:r>
-      <w:r>
-        <w:t>sprint</w:t>
-      </w:r>
-      <w:r>
-        <w:t xml:space="preserve"> was painful to watch, </w:t>
-      </w:r>
-      <w:r>
-        <w:t>u brought like the worst guns for bugs</w:t>
-      </w:r>
-      <w:r>
-        <w:t>, shit wasn’t even close</w:t>
-      </w:r>
-      <w:r>
-        <w:t xml:space="preserve"> lmao</w:t>
-      </w:r>
-    </w:p>
-    <w:p>
-      <w:r>
-        <w:t xml:space="preserve">User 7: bro </w:t>
-      </w:r>
-      <w:r>
-        <w:t>was speedrunning the sprint failure</w:t>
-      </w:r>
-    </w:p>
-    <w:p>
-      <w:r>
-        <w:t xml:space="preserve">User 8: this noob ass was bragging about his skill so much and couldn’t even </w:t>
-      </w:r>
-      <w:r>
-        <w:t xml:space="preserve">clear a squid repository, </w:t>
-      </w:r>
-      <w:proofErr w:type="spellStart"/>
-      <w:r>
-        <w:t>bruuuh</w:t>
-      </w:r>
-      <w:proofErr w:type="spellEnd"/>
-    </w:p>
-    <w:p>
-      <w:r>
-        <w:lastRenderedPageBreak/>
-        <w:t xml:space="preserve">User 9: secondhand embarrassment from watching u play was insane, I’d </w:t>
-      </w:r>
-      <w:proofErr w:type="gramStart"/>
-      <w:r>
-        <w:t>actually kms</w:t>
-      </w:r>
-      <w:proofErr w:type="gramEnd"/>
-      <w:r>
-        <w:t xml:space="preserve"> if I were you</w:t>
-      </w:r>
-    </w:p>
-    <w:p>
-      <w:r>
-        <w:t>User 10: that’s crazy lmao</w:t>
-      </w:r>
-    </w:p>
-    <w:p>
-      <w:r>
-        <w:t xml:space="preserve">They love me. I know it looks like they are </w:t>
-      </w:r>
-      <w:r>
-        <w:t>bullying</w:t>
-      </w:r>
-      <w:r>
-        <w:t xml:space="preserve"> me and calling me bad at the game or something</w:t>
-      </w:r>
-      <w:r>
-        <w:t xml:space="preserve">, but it’s </w:t>
-      </w:r>
-      <w:proofErr w:type="gramStart"/>
-      <w:r>
-        <w:t xml:space="preserve">actually </w:t>
-      </w:r>
-      <w:r>
-        <w:t>fine</w:t>
-      </w:r>
-      <w:proofErr w:type="gramEnd"/>
-      <w:r>
-        <w:t>, you just don’t get it</w:t>
-      </w:r>
-      <w:r>
-        <w:t xml:space="preserve">. It’s how we show </w:t>
-      </w:r>
-      <w:r>
-        <w:t>love</w:t>
-      </w:r>
-      <w:r>
-        <w:t xml:space="preserve"> and respect for each other, just friendly roasting. They know I’m good</w:t>
-      </w:r>
-      <w:r>
-        <w:t xml:space="preserve"> at the game</w:t>
-      </w:r>
-      <w:r>
-        <w:t>, they are just fucking with me.</w:t>
-      </w:r>
-    </w:p>
-    <w:p>
-      <w:r>
-        <w:t xml:space="preserve">User 9: </w:t>
-      </w:r>
-      <w:proofErr w:type="spellStart"/>
-      <w:r>
-        <w:t>ain’t</w:t>
-      </w:r>
-      <w:proofErr w:type="spellEnd"/>
-      <w:r>
-        <w:t xml:space="preserve"> no one f</w:t>
-      </w:r>
-      <w:r>
-        <w:t xml:space="preserve">ucking </w:t>
-      </w:r>
-      <w:r>
-        <w:t>w</w:t>
-      </w:r>
-      <w:r>
-        <w:t>ith</w:t>
-      </w:r>
-      <w:r>
-        <w:t xml:space="preserve"> this dude, </w:t>
-      </w:r>
-      <w:r>
-        <w:t>kick</w:t>
-      </w:r>
-      <w:r>
-        <w:t xml:space="preserve"> his ass out of here</w:t>
-      </w:r>
-    </w:p>
-    <w:p>
-      <w:r>
-        <w:t>It’s all jokes, trust me.</w:t>
-      </w:r>
-    </w:p>
-    <w:p>
-      <w:pPr>
-        <w:pStyle w:val="Heading3"/>
-      </w:pPr>
-      <w:bookmarkStart w:id="18" w:name="_Toc216793254"/>
-      <w:r>
-        <w:t>Chance to prove yourself</w:t>
-      </w:r>
-      <w:bookmarkEnd w:id="18"/>
-    </w:p>
-    <w:p>
-      <w:r>
-        <w:t>(Screen goes back to normal)</w:t>
-      </w:r>
-    </w:p>
-    <w:p>
-      <w:r>
-        <w:t xml:space="preserve">User 10: </w:t>
-      </w:r>
-      <w:proofErr w:type="spellStart"/>
-      <w:r>
-        <w:t>yo</w:t>
-      </w:r>
-      <w:proofErr w:type="spellEnd"/>
-      <w:r>
-        <w:t xml:space="preserve">, y’all seen the news about delayed </w:t>
-      </w:r>
-      <w:r>
-        <w:t>zero</w:t>
-      </w:r>
-      <w:r>
-        <w:t xml:space="preserve"> </w:t>
-      </w:r>
-      <w:proofErr w:type="spellStart"/>
-      <w:r>
-        <w:t>dlc</w:t>
-      </w:r>
-      <w:proofErr w:type="spellEnd"/>
-      <w:r>
-        <w:t>?</w:t>
-      </w:r>
-    </w:p>
-    <w:p>
-      <w:r>
-        <w:t xml:space="preserve">User 2: yeah, </w:t>
-      </w:r>
-      <w:r>
-        <w:t>Spearhead</w:t>
-      </w:r>
-      <w:r>
-        <w:t xml:space="preserve"> can’t make the new content even for </w:t>
-      </w:r>
-      <w:r>
-        <w:t>zero</w:t>
-      </w:r>
-      <w:r>
-        <w:t xml:space="preserve"> lol</w:t>
-      </w:r>
-    </w:p>
-    <w:p>
-      <w:r>
-        <w:t xml:space="preserve">User 3: Zero the game? More like zero </w:t>
-      </w:r>
-      <w:proofErr w:type="spellStart"/>
-      <w:r>
-        <w:t>dlc</w:t>
-      </w:r>
-      <w:proofErr w:type="spellEnd"/>
-    </w:p>
-    <w:p>
-      <w:r>
-        <w:t>User 4: I will pay u not to joke ever again</w:t>
-      </w:r>
-    </w:p>
-    <w:p>
-      <w:r>
-        <w:t xml:space="preserve">User 5: holy cornball </w:t>
-      </w:r>
-    </w:p>
-    <w:p>
-      <w:r>
-        <w:t xml:space="preserve">User 6: fuck yeah, at least that means that finally </w:t>
-      </w:r>
-      <w:r>
-        <w:t>spearhead</w:t>
-      </w:r>
-      <w:r>
-        <w:t xml:space="preserve"> heard us and making </w:t>
-      </w:r>
-      <w:proofErr w:type="spellStart"/>
-      <w:r>
-        <w:t>smth</w:t>
-      </w:r>
-      <w:proofErr w:type="spellEnd"/>
-      <w:r>
-        <w:t xml:space="preserve"> new for </w:t>
-      </w:r>
-      <w:proofErr w:type="spellStart"/>
-      <w:r>
-        <w:t>cyberdivers</w:t>
-      </w:r>
-      <w:proofErr w:type="spellEnd"/>
-    </w:p>
-    <w:p>
-      <w:r>
-        <w:t xml:space="preserve">User 7: this absolutely does not mean that </w:t>
-      </w:r>
-      <w:proofErr w:type="spellStart"/>
-      <w:r>
-        <w:t>bruh</w:t>
-      </w:r>
-      <w:proofErr w:type="spellEnd"/>
-      <w:r>
-        <w:t>, they just can’t do shit</w:t>
-      </w:r>
-    </w:p>
-    <w:p>
-      <w:r>
-        <w:t xml:space="preserve">User 12: </w:t>
-      </w:r>
-      <w:r>
-        <w:t>zero</w:t>
-      </w:r>
-      <w:r>
-        <w:t xml:space="preserve"> </w:t>
-      </w:r>
-      <w:r>
-        <w:t xml:space="preserve">fans </w:t>
-      </w:r>
-      <w:r>
-        <w:t xml:space="preserve">are in shambles </w:t>
-      </w:r>
-      <w:proofErr w:type="spellStart"/>
-      <w:r>
-        <w:t>rn</w:t>
-      </w:r>
-      <w:proofErr w:type="spellEnd"/>
-    </w:p>
-    <w:p>
-      <w:r>
-        <w:t>User 8: maybe we will finally get a</w:t>
-      </w:r>
-      <w:r>
-        <w:t>n</w:t>
-      </w:r>
-      <w:r>
-        <w:t xml:space="preserve"> </w:t>
-      </w:r>
-      <w:proofErr w:type="spellStart"/>
-      <w:r>
-        <w:t>ak</w:t>
-      </w:r>
-      <w:proofErr w:type="spellEnd"/>
-      <w:r>
-        <w:t xml:space="preserve"> 4.7.0 buff</w:t>
-      </w:r>
-    </w:p>
-    <w:p>
-      <w:r>
-        <w:t xml:space="preserve">User 11: </w:t>
-      </w:r>
-      <w:proofErr w:type="spellStart"/>
-      <w:r>
-        <w:t>ak</w:t>
-      </w:r>
-      <w:proofErr w:type="spellEnd"/>
-      <w:r>
-        <w:t xml:space="preserve"> 4.7.0 is already op</w:t>
-      </w:r>
-      <w:r>
-        <w:t xml:space="preserve">, u </w:t>
-      </w:r>
-      <w:r>
-        <w:t>just don’t know how to play with it</w:t>
-      </w:r>
-      <w:r>
-        <w:t xml:space="preserve">, I can easily </w:t>
-      </w:r>
-      <w:r>
-        <w:t xml:space="preserve">clear </w:t>
-      </w:r>
-      <w:proofErr w:type="gramStart"/>
-      <w:r>
-        <w:t>bugs source</w:t>
-      </w:r>
-      <w:proofErr w:type="gramEnd"/>
-      <w:r>
-        <w:t xml:space="preserve"> solo with it, maybe with vibe strike stratagem.</w:t>
-      </w:r>
-    </w:p>
-    <w:p>
-      <w:r>
-        <w:t xml:space="preserve">User 9: </w:t>
-      </w:r>
-      <w:r>
-        <w:t xml:space="preserve">vibe strike </w:t>
-      </w:r>
-      <w:proofErr w:type="gramStart"/>
-      <w:r>
-        <w:t>set’s</w:t>
-      </w:r>
-      <w:proofErr w:type="gramEnd"/>
-      <w:r>
-        <w:t xml:space="preserve"> </w:t>
-      </w:r>
-      <w:proofErr w:type="spellStart"/>
-      <w:r>
-        <w:t>ur</w:t>
-      </w:r>
-      <w:proofErr w:type="spellEnd"/>
-      <w:r>
-        <w:t xml:space="preserve"> teammates on fire, it’s the worst stratagem in the game</w:t>
-      </w:r>
-      <w:r>
-        <w:t xml:space="preserve">, </w:t>
-      </w:r>
-      <w:r>
-        <w:t>unless u r retarded ofc</w:t>
-      </w:r>
-    </w:p>
-    <w:p>
-      <w:r>
-        <w:t xml:space="preserve">Ah yes, </w:t>
-      </w:r>
-      <w:r>
-        <w:t>Zero</w:t>
-      </w:r>
-      <w:r>
-        <w:t>. Made by the same developer, Sp</w:t>
-      </w:r>
-      <w:r>
-        <w:t>earhead Studios</w:t>
-      </w:r>
-      <w:r>
-        <w:t xml:space="preserve">, as </w:t>
-      </w:r>
-      <w:r>
-        <w:t>our game</w:t>
-      </w:r>
-      <w:r>
-        <w:t>. Instead of making content and patches</w:t>
-      </w:r>
-      <w:r>
-        <w:t xml:space="preserve"> for </w:t>
-      </w:r>
-      <w:proofErr w:type="spellStart"/>
-      <w:r>
-        <w:t>Cyberdivers</w:t>
-      </w:r>
-      <w:proofErr w:type="spellEnd"/>
-      <w:r>
-        <w:t>, they decided to make some random ass</w:t>
-      </w:r>
-      <w:r>
-        <w:t xml:space="preserve"> spin-off</w:t>
-      </w:r>
-      <w:r>
-        <w:t>,</w:t>
-      </w:r>
-      <w:r>
-        <w:t xml:space="preserve"> and the game wasn’t even that good.</w:t>
-      </w:r>
-      <w:r>
-        <w:t xml:space="preserve"> And now they are working on the </w:t>
-      </w:r>
-      <w:proofErr w:type="spellStart"/>
-      <w:r>
-        <w:t>dlc</w:t>
-      </w:r>
-      <w:proofErr w:type="spellEnd"/>
-      <w:r>
-        <w:t xml:space="preserve"> for it</w:t>
-      </w:r>
-      <w:r>
-        <w:t xml:space="preserve">, while </w:t>
-      </w:r>
-      <w:proofErr w:type="spellStart"/>
-      <w:r>
-        <w:t>cyberdivers</w:t>
-      </w:r>
-      <w:proofErr w:type="spellEnd"/>
-      <w:r>
-        <w:t xml:space="preserve"> </w:t>
-      </w:r>
       <w:r>
         <w:t>is</w:t>
       </w:r>
@@ -5791,7 +5808,6 @@
     </w:p>
     <w:p>
       <w:r>
-        <w:lastRenderedPageBreak/>
         <w:t>User 11: maybe don’t be a moron and don’t stand right next to it next time, might help idk</w:t>
       </w:r>
     </w:p>
@@ -5898,6 +5914,7 @@
     </w:p>
     <w:p>
       <w:r>
+        <w:lastRenderedPageBreak/>
         <w:t xml:space="preserve">Bruh what? “Let </w:t>
       </w:r>
       <w:proofErr w:type="spellStart"/>
@@ -6202,931 +6219,931 @@
         <w:t xml:space="preserve"> asshole, moron, retard, fuckwit, dumbass, braindead, stupid, dickhead</w:t>
       </w:r>
       <w:r>
-        <w:t xml:space="preserve">, brain-numbing, </w:t>
-      </w:r>
+        <w:t xml:space="preserve">, brain-numbing, room temperature </w:t>
+      </w:r>
+      <w:proofErr w:type="spellStart"/>
+      <w:r>
+        <w:t>iq</w:t>
+      </w:r>
+      <w:proofErr w:type="spellEnd"/>
+      <w:r>
+        <w:t xml:space="preserve">, </w:t>
+      </w:r>
+      <w:r>
+        <w:t xml:space="preserve">motherfucker, </w:t>
+      </w:r>
+      <w:proofErr w:type="spellStart"/>
+      <w:r>
+        <w:t>fatherfucker</w:t>
+      </w:r>
+      <w:proofErr w:type="spellEnd"/>
+      <w:r>
+        <w:t xml:space="preserve">, </w:t>
+      </w:r>
+      <w:r>
+        <w:t xml:space="preserve">product of the </w:t>
+      </w:r>
+      <w:r>
+        <w:t>incest</w:t>
+      </w:r>
+      <w:r>
+        <w:t>, incel, degenerate, window licker, cognitively challenged</w:t>
+      </w:r>
+      <w:r>
+        <w:t>, dimwit</w:t>
+      </w:r>
+    </w:p>
+    <w:p>
+      <w:r>
+        <w:t>(Screen goes blurry and then goes back to red)</w:t>
+      </w:r>
+    </w:p>
+    <w:p>
+      <w:r>
+        <w:t xml:space="preserve">fuckface, </w:t>
+      </w:r>
+      <w:proofErr w:type="spellStart"/>
+      <w:r>
+        <w:t>shitfuck</w:t>
+      </w:r>
+      <w:proofErr w:type="spellEnd"/>
+      <w:r>
+        <w:t xml:space="preserve">, </w:t>
+      </w:r>
+      <w:proofErr w:type="spellStart"/>
+      <w:r>
+        <w:t>fuckfuck</w:t>
+      </w:r>
+      <w:proofErr w:type="spellEnd"/>
+      <w:r>
+        <w:t xml:space="preserve"> but</w:t>
+      </w:r>
+      <w:r>
+        <w:t xml:space="preserve"> at least we are honest</w:t>
+      </w:r>
+      <w:r>
+        <w:t>. Brutal, but honest</w:t>
+      </w:r>
+      <w:r>
+        <w:t>. Yes, we won’t mince our words and roast your ass to the crust, but you will learn from it and be better. And these guys thinking they are helping anyone with this fake ass niceness.</w:t>
+      </w:r>
+    </w:p>
+    <w:p>
+      <w:r>
+        <w:t>They are just delusional, aren’t they</w:t>
+      </w:r>
+      <w:r>
+        <w:t>.</w:t>
+      </w:r>
+    </w:p>
+    <w:p>
+      <w:r>
+        <w:t>(Screen goes normal)</w:t>
+      </w:r>
+    </w:p>
+    <w:p>
       <w:r>
         <w:lastRenderedPageBreak/>
-        <w:t xml:space="preserve">room temperature </w:t>
-      </w:r>
-      <w:proofErr w:type="spellStart"/>
-      <w:r>
-        <w:t>iq</w:t>
-      </w:r>
-      <w:proofErr w:type="spellEnd"/>
-      <w:r>
-        <w:t xml:space="preserve">, </w:t>
-      </w:r>
-      <w:r>
-        <w:t xml:space="preserve">motherfucker, </w:t>
-      </w:r>
-      <w:proofErr w:type="spellStart"/>
-      <w:r>
-        <w:t>fatherfucker</w:t>
-      </w:r>
-      <w:proofErr w:type="spellEnd"/>
-      <w:r>
-        <w:t xml:space="preserve">, </w:t>
-      </w:r>
-      <w:r>
-        <w:t xml:space="preserve">product of the </w:t>
-      </w:r>
-      <w:r>
-        <w:t>incest</w:t>
-      </w:r>
-      <w:r>
-        <w:t>, incel, degenerate, window licker, cognitively challenged</w:t>
-      </w:r>
-      <w:r>
-        <w:t>, dimwit</w:t>
-      </w:r>
-    </w:p>
-    <w:p>
-      <w:r>
-        <w:t>(Screen goes blurry and then goes back to red)</w:t>
-      </w:r>
-    </w:p>
-    <w:p>
-      <w:r>
-        <w:t xml:space="preserve">fuckface, </w:t>
-      </w:r>
-      <w:proofErr w:type="spellStart"/>
-      <w:r>
-        <w:t>shitfuck</w:t>
-      </w:r>
-      <w:proofErr w:type="spellEnd"/>
-      <w:r>
-        <w:t xml:space="preserve">, </w:t>
-      </w:r>
-      <w:proofErr w:type="spellStart"/>
-      <w:r>
-        <w:t>fuckfuck</w:t>
-      </w:r>
-      <w:proofErr w:type="spellEnd"/>
-      <w:r>
-        <w:t xml:space="preserve"> but</w:t>
-      </w:r>
-      <w:r>
-        <w:t xml:space="preserve"> at least we are honest</w:t>
-      </w:r>
-      <w:r>
-        <w:t>. Brutal, but honest</w:t>
-      </w:r>
-      <w:r>
-        <w:t>. Yes, we won’t mince our words and roast your ass to the crust, but you will learn from it and be better. And these guys thinking they are helping anyone with this fake ass niceness.</w:t>
-      </w:r>
-    </w:p>
-    <w:p>
-      <w:r>
-        <w:t>They are just delusional, aren’t they</w:t>
+        <w:t xml:space="preserve">(Ui elements start to </w:t>
+      </w:r>
+      <w:proofErr w:type="gramStart"/>
+      <w:r>
+        <w:t>fall down</w:t>
+      </w:r>
+      <w:proofErr w:type="gramEnd"/>
+      <w:r>
+        <w:t>)</w:t>
+      </w:r>
+    </w:p>
+    <w:p>
+      <w:r>
+        <w:t xml:space="preserve">Nah, this sub should go down. I </w:t>
+      </w:r>
+      <w:r>
+        <w:t>remember</w:t>
+      </w:r>
+      <w:r>
+        <w:t xml:space="preserve"> back when I was a kid, my mom sent me to do some programming courses</w:t>
+      </w:r>
+      <w:r>
+        <w:t xml:space="preserve"> </w:t>
+      </w:r>
+      <w:r>
+        <w:t xml:space="preserve">and I learned </w:t>
+      </w:r>
+      <w:proofErr w:type="spellStart"/>
+      <w:r>
+        <w:t>smth</w:t>
+      </w:r>
+      <w:proofErr w:type="spellEnd"/>
+      <w:r>
+        <w:t xml:space="preserve"> about </w:t>
+      </w:r>
+      <w:proofErr w:type="spellStart"/>
+      <w:r>
+        <w:t>webdev</w:t>
+      </w:r>
+      <w:proofErr w:type="spellEnd"/>
+      <w:r>
+        <w:t xml:space="preserve"> and some cybersecurity stuff</w:t>
+      </w:r>
+      <w:r>
+        <w:t>, like phishing</w:t>
       </w:r>
       <w:r>
         <w:t>.</w:t>
       </w:r>
-    </w:p>
-    <w:p>
-      <w:r>
-        <w:t>(Screen goes normal)</w:t>
-      </w:r>
-    </w:p>
-    <w:p>
-      <w:r>
-        <w:t xml:space="preserve">(Ui elements start to </w:t>
+      <w:r>
+        <w:t xml:space="preserve"> Shit, it was ages ago. Met some cool guys there, but we didn’t really click. They </w:t>
+      </w:r>
+      <w:r>
+        <w:t>thought</w:t>
+      </w:r>
+      <w:r>
+        <w:t xml:space="preserve"> I was </w:t>
+      </w:r>
+      <w:proofErr w:type="spellStart"/>
+      <w:r>
+        <w:t>kinda</w:t>
+      </w:r>
+      <w:proofErr w:type="spellEnd"/>
+      <w:r>
+        <w:t xml:space="preserve"> weird. Well, whatever, who gives a shit right? </w:t>
+      </w:r>
+    </w:p>
+    <w:p>
+      <w:r>
+        <w:t>Anyway,</w:t>
+      </w:r>
+      <w:r>
+        <w:t xml:space="preserve"> </w:t>
+      </w:r>
+      <w:r>
+        <w:t>what if</w:t>
+      </w:r>
+      <w:r>
+        <w:t xml:space="preserve"> I could </w:t>
+      </w:r>
+      <w:r>
+        <w:t>create</w:t>
+      </w:r>
+      <w:r>
+        <w:t xml:space="preserve"> a fake website to steal </w:t>
+      </w:r>
+      <w:r>
+        <w:t>zero</w:t>
+      </w:r>
+      <w:r>
+        <w:t xml:space="preserve"> sub admin’s </w:t>
+      </w:r>
+      <w:r>
+        <w:t>account</w:t>
+      </w:r>
+      <w:r>
+        <w:t xml:space="preserve"> and take over the sub</w:t>
+      </w:r>
+      <w:r>
+        <w:t xml:space="preserve">? I could show </w:t>
+      </w:r>
+      <w:r>
+        <w:t>them</w:t>
+      </w:r>
+      <w:r>
+        <w:t xml:space="preserve"> what </w:t>
       </w:r>
       <w:proofErr w:type="gramStart"/>
       <w:r>
-        <w:t>fall down</w:t>
+        <w:t>the real</w:t>
       </w:r>
       <w:proofErr w:type="gramEnd"/>
       <w:r>
+        <w:t xml:space="preserve"> life is.</w:t>
+      </w:r>
+      <w:r>
+        <w:t xml:space="preserve"> </w:t>
+      </w:r>
+      <w:r>
+        <w:t xml:space="preserve">I should </w:t>
+      </w:r>
+      <w:r>
+        <w:t xml:space="preserve">let my </w:t>
+      </w:r>
+      <w:r>
+        <w:t>friends</w:t>
+      </w:r>
+      <w:r>
+        <w:t xml:space="preserve"> </w:t>
+      </w:r>
+      <w:r>
+        <w:t xml:space="preserve">in </w:t>
+      </w:r>
+      <w:proofErr w:type="spellStart"/>
+      <w:r>
+        <w:t>cyberdivers</w:t>
+      </w:r>
+      <w:proofErr w:type="spellEnd"/>
+      <w:r>
+        <w:t xml:space="preserve"> chat</w:t>
+      </w:r>
+      <w:r>
+        <w:t xml:space="preserve"> know</w:t>
+      </w:r>
+      <w:r>
+        <w:t>, I’m sure they will be as excited as I am r</w:t>
+      </w:r>
+      <w:r>
+        <w:t xml:space="preserve">ight </w:t>
+      </w:r>
+      <w:r>
+        <w:t>n</w:t>
+      </w:r>
+      <w:r>
+        <w:t>ow</w:t>
+      </w:r>
+      <w:r>
+        <w:t xml:space="preserve"> </w:t>
+      </w:r>
+      <w:r>
+        <w:t>to get back at these dumbasses</w:t>
+      </w:r>
+      <w:r>
+        <w:t>.</w:t>
+      </w:r>
+    </w:p>
+    <w:p>
+      <w:r>
+        <w:t>(User is prompted to go to the sc2 chat)</w:t>
+      </w:r>
+    </w:p>
+    <w:p>
+      <w:proofErr w:type="spellStart"/>
+      <w:r>
+        <w:t>Main_hero</w:t>
+      </w:r>
+      <w:proofErr w:type="spellEnd"/>
+      <w:r>
+        <w:t xml:space="preserve">: I’m </w:t>
+      </w:r>
+      <w:proofErr w:type="spellStart"/>
+      <w:r>
+        <w:t>gonna</w:t>
+      </w:r>
+      <w:proofErr w:type="spellEnd"/>
+      <w:r>
+        <w:t xml:space="preserve"> hack </w:t>
+      </w:r>
+      <w:r>
+        <w:t>zero</w:t>
+      </w:r>
+      <w:r>
+        <w:t xml:space="preserve"> sub</w:t>
+      </w:r>
+    </w:p>
+    <w:p>
+      <w:r>
+        <w:t>User 3: lmao what</w:t>
+      </w:r>
+    </w:p>
+    <w:p>
+      <w:r>
+        <w:t>User 4: AHAHAHAH</w:t>
+      </w:r>
+    </w:p>
+    <w:p>
+      <w:r>
+        <w:t>User 5: calm down, Mr. Robot</w:t>
+      </w:r>
+    </w:p>
+    <w:p>
+      <w:r>
+        <w:t>(Screen goes slightly red)</w:t>
+      </w:r>
+    </w:p>
+    <w:p>
+      <w:r>
+        <w:t xml:space="preserve">User 6: u can’t even use a keyboard son </w:t>
+      </w:r>
+      <w:proofErr w:type="spellStart"/>
+      <w:r>
+        <w:t>fym</w:t>
+      </w:r>
+      <w:proofErr w:type="spellEnd"/>
+      <w:r>
+        <w:t xml:space="preserve"> hack</w:t>
+      </w:r>
+    </w:p>
+    <w:p>
+      <w:r>
+        <w:t>User 7: r u like 13?</w:t>
+      </w:r>
+    </w:p>
+    <w:p>
+      <w:r>
+        <w:t>User 8: are we deadass lmao</w:t>
+      </w:r>
+    </w:p>
+    <w:p>
+      <w:r>
+        <w:t>User 9: AHAHAH</w:t>
+      </w:r>
+    </w:p>
+    <w:p>
+      <w:proofErr w:type="spellStart"/>
+      <w:r>
+        <w:t>Main_hero</w:t>
+      </w:r>
+      <w:proofErr w:type="spellEnd"/>
+      <w:r>
+        <w:t xml:space="preserve">: nah y’all will see, I </w:t>
+      </w:r>
+      <w:proofErr w:type="gramStart"/>
+      <w:r>
+        <w:t>actually can</w:t>
+      </w:r>
+      <w:proofErr w:type="gramEnd"/>
+      <w:r>
+        <w:t xml:space="preserve"> do it</w:t>
+      </w:r>
+    </w:p>
+    <w:p>
+      <w:r>
+        <w:t xml:space="preserve">User 4: </w:t>
+      </w:r>
+      <w:proofErr w:type="spellStart"/>
+      <w:r>
+        <w:t>bro</w:t>
+      </w:r>
+      <w:r>
+        <w:t>chacho</w:t>
+      </w:r>
+      <w:proofErr w:type="spellEnd"/>
+      <w:r>
+        <w:t xml:space="preserve"> stfu</w:t>
+      </w:r>
+    </w:p>
+    <w:p>
+      <w:r>
+        <w:t xml:space="preserve">User 6: </w:t>
+      </w:r>
+      <w:proofErr w:type="spellStart"/>
+      <w:r>
+        <w:t>im</w:t>
+      </w:r>
+      <w:proofErr w:type="spellEnd"/>
+      <w:r>
+        <w:t xml:space="preserve"> crying wtf are u talking about </w:t>
+      </w:r>
+      <w:proofErr w:type="spellStart"/>
+      <w:r>
+        <w:t>lmaooo</w:t>
+      </w:r>
+      <w:proofErr w:type="spellEnd"/>
+    </w:p>
+    <w:p>
+      <w:r>
+        <w:t xml:space="preserve">User 5: u r like in the top 10 worst </w:t>
+      </w:r>
+      <w:proofErr w:type="spellStart"/>
+      <w:r>
+        <w:t>cyberdivers</w:t>
+      </w:r>
+      <w:proofErr w:type="spellEnd"/>
+      <w:r>
+        <w:t xml:space="preserve"> oat and u r saying u can hack anything? Bruh wtf</w:t>
+      </w:r>
+    </w:p>
+    <w:p>
+      <w:r>
+        <w:t xml:space="preserve">User 13: instant </w:t>
+      </w:r>
+      <w:proofErr w:type="spellStart"/>
+      <w:r>
+        <w:t>cyberdivers</w:t>
+      </w:r>
+      <w:proofErr w:type="spellEnd"/>
+      <w:r>
+        <w:t xml:space="preserve"> classic</w:t>
+      </w:r>
+    </w:p>
+    <w:p>
+      <w:r>
+        <w:t>User</w:t>
+      </w:r>
+      <w:r>
+        <w:t xml:space="preserve"> 11: son`</w:t>
+      </w:r>
+    </w:p>
+    <w:p>
+      <w:r>
+        <w:t xml:space="preserve">User 10: bro is a poser lmao, </w:t>
+      </w:r>
+      <w:proofErr w:type="spellStart"/>
+      <w:r>
+        <w:t>proly</w:t>
+      </w:r>
+      <w:proofErr w:type="spellEnd"/>
+      <w:r>
+        <w:t xml:space="preserve"> don’t even know what is </w:t>
+      </w:r>
+      <w:proofErr w:type="spellStart"/>
+      <w:r>
+        <w:t>sqli</w:t>
+      </w:r>
+      <w:proofErr w:type="spellEnd"/>
+      <w:r>
+        <w:t xml:space="preserve"> is lol</w:t>
+      </w:r>
+    </w:p>
+    <w:p>
+      <w:r>
+        <w:lastRenderedPageBreak/>
+        <w:t xml:space="preserve">No </w:t>
+      </w:r>
+      <w:proofErr w:type="spellStart"/>
+      <w:r>
+        <w:t>no</w:t>
+      </w:r>
+      <w:proofErr w:type="spellEnd"/>
+      <w:r>
+        <w:t xml:space="preserve">, I know what it is, it’s a language…for hacking databases…or something. </w:t>
+      </w:r>
+      <w:r>
+        <w:t>It doesn’t</w:t>
+      </w:r>
+      <w:r>
+        <w:t xml:space="preserve"> matter, they’ll see, I absolutely can do it.</w:t>
+      </w:r>
+    </w:p>
+    <w:p>
+      <w:pPr>
+        <w:pStyle w:val="Heading3"/>
+      </w:pPr>
+      <w:bookmarkStart w:id="19" w:name="_Toc216793255"/>
+      <w:r>
+        <w:t>Plan and execution</w:t>
+      </w:r>
+      <w:bookmarkEnd w:id="19"/>
+    </w:p>
+    <w:p>
+      <w:r>
+        <w:t>(Screen goes black)</w:t>
+      </w:r>
+    </w:p>
+    <w:p>
+      <w:r>
+        <w:t xml:space="preserve">Alright, I need a plan. How am I </w:t>
+      </w:r>
+      <w:proofErr w:type="spellStart"/>
+      <w:r>
+        <w:t>gonna</w:t>
+      </w:r>
+      <w:proofErr w:type="spellEnd"/>
+      <w:r>
+        <w:t xml:space="preserve"> do that? Brief search on phishing shows that </w:t>
+      </w:r>
+      <w:r>
+        <w:t>hackers send fake login screens and people fall for them. Why don’t I do the same</w:t>
+      </w:r>
+      <w:r>
+        <w:t xml:space="preserve">? </w:t>
+      </w:r>
+      <w:r>
+        <w:t xml:space="preserve">Admin will click on the link and…well yeah, he’ll probably suspect something. Well, </w:t>
+      </w:r>
+      <w:proofErr w:type="spellStart"/>
+      <w:r>
+        <w:t>ummm</w:t>
+      </w:r>
+      <w:proofErr w:type="spellEnd"/>
+      <w:r>
+        <w:t>…</w:t>
+      </w:r>
+      <w:proofErr w:type="spellStart"/>
+      <w:r>
+        <w:t>maybee</w:t>
+      </w:r>
+      <w:proofErr w:type="spellEnd"/>
+      <w:r>
+        <w:t xml:space="preserve"> </w:t>
+      </w:r>
+      <w:r>
+        <w:t>…</w:t>
+      </w:r>
+      <w:proofErr w:type="spellStart"/>
+      <w:proofErr w:type="gramStart"/>
+      <w:r>
+        <w:t>uhhh</w:t>
+      </w:r>
+      <w:proofErr w:type="spellEnd"/>
+      <w:r>
+        <w:t>..</w:t>
+      </w:r>
+      <w:proofErr w:type="gramEnd"/>
+      <w:r>
+        <w:t xml:space="preserve"> </w:t>
+      </w:r>
+      <w:r>
+        <w:t>I need to bait</w:t>
+      </w:r>
+      <w:r>
+        <w:t xml:space="preserve"> him</w:t>
+      </w:r>
+      <w:r>
+        <w:t>!</w:t>
+      </w:r>
+      <w:r>
+        <w:t xml:space="preserve"> </w:t>
+      </w:r>
+    </w:p>
+    <w:p>
+      <w:r>
+        <w:t xml:space="preserve">(Chat window appears with message from </w:t>
+      </w:r>
+      <w:proofErr w:type="spellStart"/>
+      <w:r>
+        <w:t>main_hero</w:t>
+      </w:r>
+      <w:proofErr w:type="spellEnd"/>
+      <w:r>
+        <w:t xml:space="preserve"> about the post)</w:t>
+      </w:r>
+    </w:p>
+    <w:p>
+      <w:r>
+        <w:t>Like, I’ll report to him some post which needs to be deleted, but it won’t be an actual post, it will be a fake post</w:t>
+      </w:r>
+      <w:r>
+        <w:t>!</w:t>
+      </w:r>
+      <w:r>
+        <w:t xml:space="preserve"> Admin will click on that to check it out</w:t>
+      </w:r>
+    </w:p>
+    <w:p>
+      <w:r>
+        <w:t>(User is prompted to click on the link)</w:t>
+      </w:r>
+    </w:p>
+    <w:p>
+      <w:r>
+        <w:t xml:space="preserve">(Fake </w:t>
+      </w:r>
+      <w:proofErr w:type="gramStart"/>
+      <w:r>
+        <w:t>post appear</w:t>
+      </w:r>
+      <w:r>
+        <w:t>s</w:t>
+      </w:r>
+      <w:proofErr w:type="gramEnd"/>
+      <w:r>
         <w:t>)</w:t>
       </w:r>
     </w:p>
     <w:p>
       <w:r>
-        <w:t xml:space="preserve">Nah, this sub should go down. I </w:t>
-      </w:r>
-      <w:r>
-        <w:t>remember</w:t>
-      </w:r>
-      <w:r>
-        <w:t xml:space="preserve"> back when I was a kid, my mom sent me to do some programming courses</w:t>
-      </w:r>
+        <w:t>Admin clicks on the delete button</w:t>
+      </w:r>
+    </w:p>
+    <w:p>
+      <w:r>
+        <w:t>(User is prompted to delete the post)</w:t>
+      </w:r>
+    </w:p>
+    <w:p>
+      <w:r>
+        <w:t xml:space="preserve">and suddenly it takes him to fake login screen with message like </w:t>
+      </w:r>
+      <w:proofErr w:type="spellStart"/>
+      <w:r>
+        <w:t>ur</w:t>
+      </w:r>
+      <w:proofErr w:type="spellEnd"/>
       <w:r>
         <w:t xml:space="preserve"> </w:t>
       </w:r>
       <w:r>
-        <w:t xml:space="preserve">and I learned </w:t>
-      </w:r>
-      <w:proofErr w:type="spellStart"/>
-      <w:r>
-        <w:t>smth</w:t>
-      </w:r>
-      <w:proofErr w:type="spellEnd"/>
-      <w:r>
-        <w:t xml:space="preserve"> about </w:t>
-      </w:r>
-      <w:proofErr w:type="spellStart"/>
-      <w:r>
-        <w:t>webdev</w:t>
-      </w:r>
-      <w:proofErr w:type="spellEnd"/>
-      <w:r>
-        <w:t xml:space="preserve"> and some cybersecurity stuff</w:t>
-      </w:r>
-      <w:r>
-        <w:t>, like phishing</w:t>
-      </w:r>
-      <w:r>
-        <w:t>.</w:t>
-      </w:r>
-      <w:r>
-        <w:t xml:space="preserve"> Shit, it was ages ago. Met some cool guys there, but we didn’t really click. They </w:t>
-      </w:r>
-      <w:r>
-        <w:t>thought</w:t>
-      </w:r>
-      <w:r>
-        <w:t xml:space="preserve"> I was </w:t>
-      </w:r>
-      <w:proofErr w:type="spellStart"/>
-      <w:r>
-        <w:t>kinda</w:t>
-      </w:r>
-      <w:proofErr w:type="spellEnd"/>
-      <w:r>
-        <w:t xml:space="preserve"> weird. Well, whatever, who gives a shit right? </w:t>
-      </w:r>
-    </w:p>
-    <w:p>
-      <w:r>
-        <w:t>Anyway,</w:t>
-      </w:r>
+        <w:t>session</w:t>
+      </w:r>
+      <w:r>
+        <w:t xml:space="preserve"> is expired, sign in again</w:t>
+      </w:r>
+    </w:p>
+    <w:p>
+      <w:r>
+        <w:t>(Login screen appears, with the message “</w:t>
+      </w:r>
+      <w:proofErr w:type="spellStart"/>
+      <w:r>
+        <w:t>ur</w:t>
+      </w:r>
+      <w:proofErr w:type="spellEnd"/>
       <w:r>
         <w:t xml:space="preserve"> </w:t>
       </w:r>
       <w:r>
-        <w:t>what if</w:t>
-      </w:r>
-      <w:r>
-        <w:t xml:space="preserve"> I could </w:t>
-      </w:r>
-      <w:r>
-        <w:t>create</w:t>
-      </w:r>
-      <w:r>
-        <w:t xml:space="preserve"> a fake website to steal </w:t>
-      </w:r>
-      <w:r>
-        <w:t>zero</w:t>
-      </w:r>
-      <w:r>
-        <w:t xml:space="preserve"> sub admin’s </w:t>
-      </w:r>
-      <w:r>
-        <w:t>account</w:t>
-      </w:r>
-      <w:r>
-        <w:t xml:space="preserve"> and take over the sub</w:t>
-      </w:r>
-      <w:r>
-        <w:t xml:space="preserve">? I could show </w:t>
-      </w:r>
-      <w:r>
-        <w:t>them</w:t>
-      </w:r>
-      <w:r>
-        <w:t xml:space="preserve"> what </w:t>
+        <w:t>session</w:t>
+      </w:r>
+      <w:r>
+        <w:t xml:space="preserve"> is expired, please sign in again”)</w:t>
+      </w:r>
+    </w:p>
+    <w:p>
+      <w:r>
+        <w:t xml:space="preserve">Admin will login again, to finally delete this post and boom, his creds are mine. Admin will see that the post was </w:t>
+      </w:r>
+      <w:r>
+        <w:t>deleted,</w:t>
+      </w:r>
+      <w:r>
+        <w:t xml:space="preserve"> and he won’t even know that his creds </w:t>
+      </w:r>
+      <w:r>
+        <w:t>were stolen</w:t>
+      </w:r>
+      <w:r>
+        <w:t>!</w:t>
+      </w:r>
+    </w:p>
+    <w:p>
+      <w:r>
+        <w:t xml:space="preserve">(User is prompted to login and </w:t>
       </w:r>
       <w:proofErr w:type="gramStart"/>
       <w:r>
-        <w:t>the real</w:t>
+        <w:t>forwarded</w:t>
       </w:r>
       <w:proofErr w:type="gramEnd"/>
       <w:r>
-        <w:t xml:space="preserve"> life is.</w:t>
-      </w:r>
+        <w:t xml:space="preserve"> to page where the post is deleted)</w:t>
+      </w:r>
+    </w:p>
+    <w:p>
+      <w:r>
+        <w:t>(Screen goes black)</w:t>
+      </w:r>
+    </w:p>
+    <w:p>
+      <w:r>
+        <w:t>I’m a genius</w:t>
+      </w:r>
+      <w:r>
+        <w:t>!</w:t>
+      </w:r>
+    </w:p>
+    <w:p>
+      <w:r>
+        <w:t>Now I just need to figure out</w:t>
+      </w:r>
+      <w:r>
+        <w:t xml:space="preserve"> how to code all that.</w:t>
+      </w:r>
+    </w:p>
+    <w:p>
+      <w:r>
+        <w:t xml:space="preserve">Alright, first I </w:t>
+      </w:r>
+      <w:proofErr w:type="spellStart"/>
+      <w:r>
+        <w:t>gotta</w:t>
+      </w:r>
+      <w:proofErr w:type="spellEnd"/>
+      <w:r>
+        <w:t xml:space="preserve"> open vim. Fuck IDEs they are for pussies.</w:t>
+      </w:r>
+    </w:p>
+    <w:p>
+      <w:r>
+        <w:t>(Terminal opens with vim)</w:t>
+      </w:r>
+    </w:p>
+    <w:p>
+      <w:r>
+        <w:t xml:space="preserve">So </w:t>
+      </w:r>
+      <w:proofErr w:type="spellStart"/>
+      <w:r>
+        <w:t>uhhhhh</w:t>
+      </w:r>
+      <w:proofErr w:type="spellEnd"/>
+      <w:r>
+        <w:t xml:space="preserve">, how do I create a page? I think u need to write html tag and then umm…fuck. Hold on, I think I still have my notes from those courses. (wait) Fuck, I forgot I didn’t keep any. One time I was learning something useful and I wasn’t keeping notes. I was too smart </w:t>
+      </w:r>
+      <w:r>
+        <w:lastRenderedPageBreak/>
+        <w:t>for it, and I couldn’t be bothered to write all this useless stuff. Anyway, I think</w:t>
+      </w:r>
+      <w:r>
+        <w:t xml:space="preserve"> I’ll just ask AI. No, not for vibe coding, I’ll just ask it for… you know … general directions. Some </w:t>
+      </w:r>
+      <w:proofErr w:type="gramStart"/>
+      <w:r>
+        <w:t>boilerplate</w:t>
+      </w:r>
+      <w:proofErr w:type="gramEnd"/>
+      <w:r>
+        <w:t xml:space="preserve"> to start with, you know.</w:t>
+      </w:r>
+    </w:p>
+    <w:p>
+      <w:r>
+        <w:t>(Huge chunk of code with some ai comments appear in vim)</w:t>
+      </w:r>
+    </w:p>
+    <w:p>
+      <w:proofErr w:type="spellStart"/>
+      <w:r>
+        <w:t>Aight</w:t>
+      </w:r>
+      <w:proofErr w:type="spellEnd"/>
+      <w:r>
+        <w:t>…this goes here…</w:t>
+      </w:r>
+    </w:p>
+    <w:p>
+      <w:r>
+        <w:t>(</w:t>
+      </w:r>
+      <w:proofErr w:type="spellStart"/>
+      <w:r>
+        <w:t>Main_hero</w:t>
+      </w:r>
+      <w:proofErr w:type="spellEnd"/>
+      <w:r>
+        <w:t xml:space="preserve"> deletes all comments)</w:t>
+      </w:r>
+    </w:p>
+    <w:p>
+      <w:r>
+        <w:t xml:space="preserve">And first page </w:t>
+      </w:r>
+      <w:proofErr w:type="gramStart"/>
+      <w:r>
+        <w:t>done</w:t>
+      </w:r>
+      <w:proofErr w:type="gramEnd"/>
+      <w:r>
+        <w:t>!</w:t>
+      </w:r>
+    </w:p>
+    <w:p>
+      <w:r>
+        <w:t>(</w:t>
+      </w:r>
+      <w:proofErr w:type="spellStart"/>
+      <w:r>
+        <w:t>Main_hero</w:t>
+      </w:r>
+      <w:proofErr w:type="spellEnd"/>
+      <w:r>
+        <w:t xml:space="preserve"> tries to exit vim)</w:t>
+      </w:r>
+    </w:p>
+    <w:p>
+      <w:r>
+        <w:t xml:space="preserve">Ok, how do </w:t>
+      </w:r>
+      <w:proofErr w:type="gramStart"/>
+      <w:r>
+        <w:t>I?...fuck..</w:t>
+      </w:r>
+      <w:proofErr w:type="spellStart"/>
+      <w:proofErr w:type="gramEnd"/>
+      <w:r>
+        <w:t>uhhh</w:t>
+      </w:r>
+      <w:proofErr w:type="spellEnd"/>
+      <w:r>
+        <w:t>…I forgot again…</w:t>
+      </w:r>
+      <w:proofErr w:type="spellStart"/>
+      <w:r>
+        <w:t>uhhhh</w:t>
+      </w:r>
+      <w:proofErr w:type="spellEnd"/>
+      <w:r>
+        <w:t>…here it is!</w:t>
+      </w:r>
+    </w:p>
+    <w:p>
+      <w:r>
+        <w:t xml:space="preserve">Not too </w:t>
+      </w:r>
+      <w:proofErr w:type="gramStart"/>
+      <w:r>
+        <w:t>hard</w:t>
+      </w:r>
+      <w:proofErr w:type="gramEnd"/>
+      <w:r>
+        <w:t xml:space="preserve"> eh? Now </w:t>
+      </w:r>
+      <w:r>
+        <w:t xml:space="preserve">for </w:t>
+      </w:r>
+      <w:r>
+        <w:t>the rest of them…</w:t>
+      </w:r>
+    </w:p>
+    <w:p>
+      <w:r>
+        <w:t>(Screen goes blurry, with copy</w:t>
+      </w:r>
+      <w:r>
+        <w:t xml:space="preserve"> and </w:t>
+      </w:r>
+      <w:r>
+        <w:t xml:space="preserve">paste </w:t>
+      </w:r>
+      <w:r>
+        <w:t>timelapse</w:t>
+      </w:r>
+      <w:r>
+        <w:t xml:space="preserve"> going on in the background)</w:t>
+      </w:r>
+    </w:p>
+    <w:p>
+      <w:r>
+        <w:t>(</w:t>
+      </w:r>
+      <w:proofErr w:type="spellStart"/>
+      <w:r>
+        <w:t>Some time</w:t>
+      </w:r>
+      <w:proofErr w:type="spellEnd"/>
+      <w:r>
+        <w:t xml:space="preserve"> later)</w:t>
+      </w:r>
+    </w:p>
+    <w:p>
+      <w:r>
+        <w:t>(Screen shows running website in terminal)</w:t>
+      </w:r>
+    </w:p>
+    <w:p>
+      <w:proofErr w:type="spellStart"/>
+      <w:r>
+        <w:t>Aaaand</w:t>
+      </w:r>
+      <w:proofErr w:type="spellEnd"/>
       <w:r>
         <w:t xml:space="preserve"> </w:t>
       </w:r>
-      <w:r>
-        <w:t xml:space="preserve">I should </w:t>
-      </w:r>
-      <w:r>
-        <w:t xml:space="preserve">let my </w:t>
-      </w:r>
-      <w:r>
-        <w:t>friends</w:t>
-      </w:r>
-      <w:r>
-        <w:t xml:space="preserve"> </w:t>
-      </w:r>
-      <w:r>
-        <w:t xml:space="preserve">in </w:t>
-      </w:r>
-      <w:proofErr w:type="spellStart"/>
-      <w:r>
-        <w:t>cyberdivers</w:t>
-      </w:r>
-      <w:proofErr w:type="spellEnd"/>
-      <w:r>
-        <w:t xml:space="preserve"> chat</w:t>
-      </w:r>
-      <w:r>
-        <w:t xml:space="preserve"> know</w:t>
-      </w:r>
-      <w:r>
-        <w:t>, I’m sure they will be as excited as I am r</w:t>
-      </w:r>
-      <w:r>
-        <w:t xml:space="preserve">ight </w:t>
-      </w:r>
-      <w:r>
-        <w:t>n</w:t>
-      </w:r>
-      <w:r>
-        <w:t>ow</w:t>
-      </w:r>
-      <w:r>
-        <w:t xml:space="preserve"> </w:t>
-      </w:r>
-      <w:r>
-        <w:t>to get back at these dumbasses</w:t>
-      </w:r>
-      <w:r>
-        <w:t>.</w:t>
-      </w:r>
-    </w:p>
-    <w:p>
-      <w:r>
-        <w:t>(User is prompted to go to the sc2 chat)</w:t>
-      </w:r>
-    </w:p>
-    <w:p>
+      <w:proofErr w:type="spellStart"/>
+      <w:r>
+        <w:t>im</w:t>
+      </w:r>
+      <w:proofErr w:type="spellEnd"/>
+      <w:r>
+        <w:t xml:space="preserve"> done! Now I just need to trick sillygoose228</w:t>
+      </w:r>
+    </w:p>
+    <w:p>
+      <w:r>
+        <w:t xml:space="preserve">(Screen goes to </w:t>
+      </w:r>
+      <w:proofErr w:type="spellStart"/>
+      <w:r>
+        <w:t>main_hero’s</w:t>
+      </w:r>
+      <w:proofErr w:type="spellEnd"/>
+      <w:r>
+        <w:t xml:space="preserve"> profile page. </w:t>
+      </w:r>
+      <w:proofErr w:type="gramStart"/>
+      <w:r>
+        <w:t>User is</w:t>
+      </w:r>
+      <w:proofErr w:type="gramEnd"/>
+      <w:r>
+        <w:t xml:space="preserve"> prompted to search for sillygoose228 nickname)</w:t>
+      </w:r>
+    </w:p>
+    <w:p>
+      <w:r>
+        <w:t xml:space="preserve">God, even </w:t>
+      </w:r>
+      <w:r>
+        <w:t>h</w:t>
+      </w:r>
+      <w:r>
+        <w:t xml:space="preserve">is name is stupid. Not like mine </w:t>
+      </w:r>
+      <w:proofErr w:type="spellStart"/>
+      <w:r>
+        <w:t>tho</w:t>
+      </w:r>
+      <w:proofErr w:type="spellEnd"/>
+      <w:r>
+        <w:t xml:space="preserve">. </w:t>
+      </w:r>
       <w:proofErr w:type="spellStart"/>
       <w:r>
         <w:t>Main_hero</w:t>
       </w:r>
       <w:proofErr w:type="spellEnd"/>
       <w:r>
-        <w:t xml:space="preserve">: I’m </w:t>
-      </w:r>
-      <w:proofErr w:type="spellStart"/>
-      <w:r>
-        <w:t>gonna</w:t>
-      </w:r>
-      <w:proofErr w:type="spellEnd"/>
-      <w:r>
-        <w:t xml:space="preserve"> hack </w:t>
-      </w:r>
-      <w:r>
-        <w:t>zero</w:t>
-      </w:r>
-      <w:r>
-        <w:t xml:space="preserve"> sub</w:t>
-      </w:r>
-    </w:p>
-    <w:p>
-      <w:r>
-        <w:t>User 3: lmao what</w:t>
-      </w:r>
-    </w:p>
-    <w:p>
-      <w:r>
-        <w:t>User 4: AHAHAHAH</w:t>
-      </w:r>
-    </w:p>
-    <w:p>
-      <w:r>
-        <w:t>User 5: calm down, Mr. Robot</w:t>
-      </w:r>
-    </w:p>
-    <w:p>
-      <w:r>
-        <w:t>(Screen goes slightly red)</w:t>
-      </w:r>
-    </w:p>
-    <w:p>
-      <w:r>
-        <w:t xml:space="preserve">User 6: u can’t even use a keyboard son </w:t>
-      </w:r>
-      <w:proofErr w:type="spellStart"/>
-      <w:r>
-        <w:t>fym</w:t>
-      </w:r>
-      <w:proofErr w:type="spellEnd"/>
-      <w:r>
-        <w:t xml:space="preserve"> hack</w:t>
-      </w:r>
-    </w:p>
-    <w:p>
-      <w:r>
-        <w:t>User 7: r u like 13?</w:t>
-      </w:r>
-    </w:p>
-    <w:p>
-      <w:r>
-        <w:t>User 8: are we deadass lmao</w:t>
-      </w:r>
-    </w:p>
-    <w:p>
-      <w:r>
-        <w:t>User 9: AHAHAH</w:t>
-      </w:r>
-    </w:p>
-    <w:p>
-      <w:proofErr w:type="spellStart"/>
-      <w:r>
-        <w:t>Main_hero</w:t>
-      </w:r>
-      <w:proofErr w:type="spellEnd"/>
-      <w:r>
-        <w:t xml:space="preserve">: nah y’all will see, I </w:t>
-      </w:r>
-      <w:proofErr w:type="gramStart"/>
-      <w:r>
-        <w:t>actually can</w:t>
-      </w:r>
-      <w:proofErr w:type="gramEnd"/>
-      <w:r>
-        <w:t xml:space="preserve"> do it</w:t>
-      </w:r>
-    </w:p>
-    <w:p>
-      <w:r>
-        <w:t xml:space="preserve">User 4: </w:t>
-      </w:r>
-      <w:proofErr w:type="spellStart"/>
-      <w:r>
-        <w:t>bro</w:t>
-      </w:r>
-      <w:r>
-        <w:t>chacho</w:t>
-      </w:r>
-      <w:proofErr w:type="spellEnd"/>
-      <w:r>
-        <w:t xml:space="preserve"> stfu</w:t>
-      </w:r>
-    </w:p>
-    <w:p>
-      <w:r>
-        <w:lastRenderedPageBreak/>
-        <w:t xml:space="preserve">User 6: </w:t>
-      </w:r>
-      <w:proofErr w:type="spellStart"/>
-      <w:r>
-        <w:t>im</w:t>
-      </w:r>
-      <w:proofErr w:type="spellEnd"/>
-      <w:r>
-        <w:t xml:space="preserve"> crying wtf are u talking about </w:t>
-      </w:r>
-      <w:proofErr w:type="spellStart"/>
-      <w:r>
-        <w:t>lmaooo</w:t>
-      </w:r>
-      <w:proofErr w:type="spellEnd"/>
-    </w:p>
-    <w:p>
-      <w:r>
-        <w:t xml:space="preserve">User 5: u r like in the top 10 worst </w:t>
-      </w:r>
-      <w:proofErr w:type="spellStart"/>
-      <w:r>
-        <w:t>cyberdivers</w:t>
-      </w:r>
-      <w:proofErr w:type="spellEnd"/>
-      <w:r>
-        <w:t xml:space="preserve"> oat and u r saying u can hack anything? Bruh wtf</w:t>
-      </w:r>
-    </w:p>
-    <w:p>
-      <w:r>
-        <w:t xml:space="preserve">User 13: instant </w:t>
-      </w:r>
-      <w:proofErr w:type="spellStart"/>
-      <w:r>
-        <w:t>cyberdivers</w:t>
-      </w:r>
-      <w:proofErr w:type="spellEnd"/>
-      <w:r>
-        <w:t xml:space="preserve"> classic</w:t>
-      </w:r>
-    </w:p>
-    <w:p>
-      <w:r>
-        <w:t>User</w:t>
-      </w:r>
-      <w:r>
-        <w:t xml:space="preserve"> 11: son`</w:t>
-      </w:r>
-    </w:p>
-    <w:p>
-      <w:r>
-        <w:t xml:space="preserve">User 10: bro is a poser lmao, </w:t>
-      </w:r>
-      <w:proofErr w:type="spellStart"/>
-      <w:r>
-        <w:t>proly</w:t>
-      </w:r>
-      <w:proofErr w:type="spellEnd"/>
-      <w:r>
-        <w:t xml:space="preserve"> don’t even know what is </w:t>
-      </w:r>
-      <w:proofErr w:type="spellStart"/>
-      <w:r>
-        <w:t>sqli</w:t>
-      </w:r>
-      <w:proofErr w:type="spellEnd"/>
-      <w:r>
-        <w:t xml:space="preserve"> is lol</w:t>
-      </w:r>
-    </w:p>
-    <w:p>
-      <w:r>
-        <w:t xml:space="preserve">No </w:t>
-      </w:r>
-      <w:proofErr w:type="spellStart"/>
-      <w:r>
-        <w:t>no</w:t>
-      </w:r>
-      <w:proofErr w:type="spellEnd"/>
-      <w:r>
-        <w:t xml:space="preserve">, I know what it is, it’s a language…for hacking databases…or something. </w:t>
-      </w:r>
-      <w:r>
-        <w:t>It doesn’t</w:t>
-      </w:r>
-      <w:r>
-        <w:t xml:space="preserve"> matter, they’ll see, I absolutely can do it.</w:t>
-      </w:r>
-    </w:p>
-    <w:p>
-      <w:pPr>
-        <w:pStyle w:val="Heading3"/>
-      </w:pPr>
-      <w:bookmarkStart w:id="19" w:name="_Toc216793255"/>
-      <w:r>
-        <w:t>Plan and execution</w:t>
-      </w:r>
-      <w:bookmarkEnd w:id="19"/>
-    </w:p>
-    <w:p>
-      <w:r>
-        <w:t>(Screen goes black)</w:t>
-      </w:r>
-    </w:p>
-    <w:p>
-      <w:r>
-        <w:t xml:space="preserve">Alright, I need a plan. How am I </w:t>
-      </w:r>
-      <w:proofErr w:type="spellStart"/>
-      <w:r>
-        <w:t>gonna</w:t>
-      </w:r>
-      <w:proofErr w:type="spellEnd"/>
-      <w:r>
-        <w:t xml:space="preserve"> do that? Brief search on phishing shows that </w:t>
-      </w:r>
-      <w:r>
-        <w:t>hackers send fake login screens and people fall for them. Why don’t I do the same</w:t>
-      </w:r>
-      <w:r>
-        <w:t xml:space="preserve">? </w:t>
-      </w:r>
-      <w:r>
-        <w:t xml:space="preserve">Admin will click on the link and…well yeah, he’ll probably suspect something. Well, </w:t>
-      </w:r>
-      <w:proofErr w:type="spellStart"/>
-      <w:r>
-        <w:t>ummm</w:t>
-      </w:r>
-      <w:proofErr w:type="spellEnd"/>
-      <w:r>
-        <w:t>…</w:t>
-      </w:r>
-      <w:proofErr w:type="spellStart"/>
-      <w:r>
-        <w:t>maybee</w:t>
-      </w:r>
-      <w:proofErr w:type="spellEnd"/>
-      <w:r>
-        <w:t xml:space="preserve"> </w:t>
-      </w:r>
-      <w:r>
-        <w:t>…</w:t>
-      </w:r>
-      <w:proofErr w:type="spellStart"/>
-      <w:proofErr w:type="gramStart"/>
-      <w:r>
-        <w:t>uhhh</w:t>
-      </w:r>
-      <w:proofErr w:type="spellEnd"/>
-      <w:r>
-        <w:t>..</w:t>
-      </w:r>
-      <w:proofErr w:type="gramEnd"/>
-      <w:r>
-        <w:t xml:space="preserve"> </w:t>
-      </w:r>
-      <w:r>
-        <w:t>I need to bait</w:t>
-      </w:r>
-      <w:r>
-        <w:t xml:space="preserve"> him</w:t>
-      </w:r>
-      <w:r>
-        <w:t>!</w:t>
-      </w:r>
-      <w:r>
-        <w:t xml:space="preserve"> </w:t>
-      </w:r>
-    </w:p>
-    <w:p>
-      <w:r>
-        <w:t xml:space="preserve">(Chat window appears with message from </w:t>
-      </w:r>
-      <w:proofErr w:type="spellStart"/>
-      <w:r>
-        <w:t>main_hero</w:t>
-      </w:r>
-      <w:proofErr w:type="spellEnd"/>
-      <w:r>
-        <w:t xml:space="preserve"> about the post)</w:t>
-      </w:r>
-    </w:p>
-    <w:p>
-      <w:r>
-        <w:t>Like, I’ll report to him some post which needs to be deleted, but it won’t be an actual post, it will be a fake post</w:t>
-      </w:r>
-      <w:r>
-        <w:t>!</w:t>
-      </w:r>
-      <w:r>
-        <w:t xml:space="preserve"> Admin will click on that to check it out</w:t>
-      </w:r>
-    </w:p>
-    <w:p>
-      <w:r>
-        <w:t>(User is prompted to click on the link)</w:t>
-      </w:r>
-    </w:p>
-    <w:p>
-      <w:r>
-        <w:t xml:space="preserve">(Fake </w:t>
-      </w:r>
-      <w:proofErr w:type="gramStart"/>
-      <w:r>
-        <w:t>post appear</w:t>
-      </w:r>
-      <w:r>
-        <w:t>s</w:t>
-      </w:r>
-      <w:proofErr w:type="gramEnd"/>
-      <w:r>
-        <w:t>)</w:t>
-      </w:r>
-    </w:p>
-    <w:p>
-      <w:r>
-        <w:t>Admin clicks on the delete button</w:t>
-      </w:r>
-    </w:p>
-    <w:p>
-      <w:r>
-        <w:t>(User is prompted to delete the post)</w:t>
-      </w:r>
-    </w:p>
-    <w:p>
-      <w:r>
-        <w:t xml:space="preserve">and suddenly it takes him to fake login screen with message like </w:t>
-      </w:r>
-      <w:proofErr w:type="spellStart"/>
-      <w:r>
-        <w:t>ur</w:t>
-      </w:r>
-      <w:proofErr w:type="spellEnd"/>
-      <w:r>
-        <w:t xml:space="preserve"> </w:t>
-      </w:r>
-      <w:r>
-        <w:t>session</w:t>
-      </w:r>
-      <w:r>
-        <w:t xml:space="preserve"> is expired, sign in again</w:t>
-      </w:r>
-    </w:p>
-    <w:p>
-      <w:r>
-        <w:t>(Login screen appears, with the message “</w:t>
-      </w:r>
-      <w:proofErr w:type="spellStart"/>
-      <w:r>
-        <w:t>ur</w:t>
-      </w:r>
-      <w:proofErr w:type="spellEnd"/>
-      <w:r>
-        <w:t xml:space="preserve"> </w:t>
-      </w:r>
-      <w:r>
-        <w:t>session</w:t>
-      </w:r>
-      <w:r>
-        <w:t xml:space="preserve"> is expired, please sign in again”)</w:t>
-      </w:r>
-    </w:p>
-    <w:p>
-      <w:r>
-        <w:t xml:space="preserve">Admin will login again, to finally delete this post and boom, his creds are mine. Admin will see that the post was </w:t>
-      </w:r>
-      <w:r>
-        <w:t>deleted,</w:t>
-      </w:r>
-      <w:r>
-        <w:t xml:space="preserve"> and he won’t even know that his creds </w:t>
-      </w:r>
-      <w:r>
-        <w:t>were stolen</w:t>
-      </w:r>
-      <w:r>
-        <w:t>!</w:t>
-      </w:r>
-    </w:p>
-    <w:p>
-      <w:r>
-        <w:t xml:space="preserve">(User is prompted to login and </w:t>
-      </w:r>
-      <w:proofErr w:type="gramStart"/>
-      <w:r>
-        <w:t>forwarded</w:t>
-      </w:r>
-      <w:proofErr w:type="gramEnd"/>
-      <w:r>
-        <w:t xml:space="preserve"> to page where the post is deleted)</w:t>
-      </w:r>
-    </w:p>
-    <w:p>
-      <w:r>
-        <w:t>(Screen goes black)</w:t>
-      </w:r>
-    </w:p>
-    <w:p>
-      <w:r>
-        <w:lastRenderedPageBreak/>
-        <w:t>I’m a genius</w:t>
-      </w:r>
-      <w:r>
-        <w:t>!</w:t>
-      </w:r>
-    </w:p>
-    <w:p>
-      <w:r>
-        <w:t>Now I just need to figure out</w:t>
-      </w:r>
-      <w:r>
-        <w:t xml:space="preserve"> how to code all that.</w:t>
-      </w:r>
-    </w:p>
-    <w:p>
-      <w:r>
-        <w:t xml:space="preserve">Alright, first I </w:t>
-      </w:r>
-      <w:proofErr w:type="spellStart"/>
-      <w:r>
-        <w:t>gotta</w:t>
-      </w:r>
-      <w:proofErr w:type="spellEnd"/>
-      <w:r>
-        <w:t xml:space="preserve"> open vim. Fuck IDEs they are for pussies.</w:t>
-      </w:r>
-    </w:p>
-    <w:p>
-      <w:r>
-        <w:t>(Terminal opens with vim)</w:t>
-      </w:r>
-    </w:p>
-    <w:p>
-      <w:r>
-        <w:t xml:space="preserve">So </w:t>
-      </w:r>
-      <w:proofErr w:type="spellStart"/>
-      <w:r>
-        <w:t>uhhhhh</w:t>
-      </w:r>
-      <w:proofErr w:type="spellEnd"/>
-      <w:r>
-        <w:t>, how do I create a page? I think u need to write html tag and then umm…fuck. Hold on, I think I still have my notes from those courses. (wait) Fuck, I forgot I didn’t keep any. One time I was learning something useful and I wasn’t keeping notes. I was too smart for it, and I couldn’t be bothered to write all this useless stuff. Anyway, I think</w:t>
-      </w:r>
-      <w:r>
-        <w:t xml:space="preserve"> I’ll just ask AI. No, not for vibe coding, I’ll just ask it for… you know … general directions. Some </w:t>
-      </w:r>
-      <w:proofErr w:type="gramStart"/>
-      <w:r>
-        <w:t>boilerplate</w:t>
-      </w:r>
-      <w:proofErr w:type="gramEnd"/>
-      <w:r>
-        <w:t xml:space="preserve"> to start with, you know.</w:t>
-      </w:r>
-    </w:p>
-    <w:p>
-      <w:r>
-        <w:t>(Huge chunk of code with some ai comments appear in vim)</w:t>
-      </w:r>
-    </w:p>
-    <w:p>
-      <w:proofErr w:type="spellStart"/>
-      <w:r>
-        <w:t>Aight</w:t>
-      </w:r>
-      <w:proofErr w:type="spellEnd"/>
-      <w:r>
-        <w:t>…this goes here…</w:t>
-      </w:r>
-    </w:p>
-    <w:p>
-      <w:r>
-        <w:t>(</w:t>
-      </w:r>
-      <w:proofErr w:type="spellStart"/>
-      <w:r>
-        <w:t>Main_hero</w:t>
-      </w:r>
-      <w:proofErr w:type="spellEnd"/>
-      <w:r>
-        <w:t xml:space="preserve"> deletes all comments)</w:t>
-      </w:r>
-    </w:p>
-    <w:p>
-      <w:r>
-        <w:t xml:space="preserve">And first page </w:t>
-      </w:r>
-      <w:proofErr w:type="gramStart"/>
-      <w:r>
-        <w:t>done</w:t>
-      </w:r>
-      <w:proofErr w:type="gramEnd"/>
-      <w:r>
-        <w:t>!</w:t>
-      </w:r>
-    </w:p>
-    <w:p>
-      <w:r>
-        <w:t>(</w:t>
-      </w:r>
-      <w:proofErr w:type="spellStart"/>
-      <w:r>
-        <w:t>Main_hero</w:t>
-      </w:r>
-      <w:proofErr w:type="spellEnd"/>
-      <w:r>
-        <w:t xml:space="preserve"> tries to exit vim)</w:t>
-      </w:r>
-    </w:p>
-    <w:p>
-      <w:r>
-        <w:t xml:space="preserve">Ok, how do </w:t>
-      </w:r>
-      <w:proofErr w:type="gramStart"/>
-      <w:r>
-        <w:t>I?...fuck..</w:t>
-      </w:r>
-      <w:proofErr w:type="spellStart"/>
-      <w:proofErr w:type="gramEnd"/>
-      <w:r>
-        <w:t>uhhh</w:t>
-      </w:r>
-      <w:proofErr w:type="spellEnd"/>
-      <w:r>
-        <w:t>…I forgot again…</w:t>
-      </w:r>
-      <w:proofErr w:type="spellStart"/>
-      <w:r>
-        <w:t>uhhhh</w:t>
-      </w:r>
-      <w:proofErr w:type="spellEnd"/>
-      <w:r>
-        <w:t>…here it is!</w:t>
-      </w:r>
-    </w:p>
-    <w:p>
-      <w:r>
-        <w:t xml:space="preserve">Not too </w:t>
-      </w:r>
-      <w:proofErr w:type="gramStart"/>
-      <w:r>
-        <w:t>hard</w:t>
-      </w:r>
-      <w:proofErr w:type="gramEnd"/>
-      <w:r>
-        <w:t xml:space="preserve"> eh? Now </w:t>
-      </w:r>
-      <w:r>
-        <w:t xml:space="preserve">for </w:t>
-      </w:r>
-      <w:r>
-        <w:t>the rest of them…</w:t>
-      </w:r>
-    </w:p>
-    <w:p>
-      <w:r>
-        <w:t>(Screen goes blurry, with copy</w:t>
-      </w:r>
-      <w:r>
-        <w:t xml:space="preserve"> and </w:t>
-      </w:r>
-      <w:r>
-        <w:t xml:space="preserve">paste </w:t>
-      </w:r>
-      <w:r>
-        <w:t>timelapse</w:t>
-      </w:r>
-      <w:r>
-        <w:t xml:space="preserve"> going on in the background)</w:t>
-      </w:r>
-    </w:p>
-    <w:p>
-      <w:r>
-        <w:t>(</w:t>
-      </w:r>
-      <w:proofErr w:type="spellStart"/>
-      <w:r>
-        <w:t>Some time</w:t>
-      </w:r>
-      <w:proofErr w:type="spellEnd"/>
-      <w:r>
-        <w:t xml:space="preserve"> later)</w:t>
-      </w:r>
-    </w:p>
-    <w:p>
-      <w:r>
-        <w:t>(Screen shows running website in terminal)</w:t>
-      </w:r>
-    </w:p>
-    <w:p>
-      <w:proofErr w:type="spellStart"/>
-      <w:r>
-        <w:t>Aaaand</w:t>
-      </w:r>
-      <w:proofErr w:type="spellEnd"/>
-      <w:r>
-        <w:t xml:space="preserve"> </w:t>
-      </w:r>
-      <w:proofErr w:type="spellStart"/>
-      <w:r>
-        <w:t>im</w:t>
-      </w:r>
-      <w:proofErr w:type="spellEnd"/>
-      <w:r>
-        <w:t xml:space="preserve"> done! Now I just need to trick sillygoose228</w:t>
-      </w:r>
-    </w:p>
-    <w:p>
-      <w:r>
-        <w:t xml:space="preserve">(Screen goes to </w:t>
-      </w:r>
-      <w:proofErr w:type="spellStart"/>
-      <w:r>
-        <w:t>main_hero’s</w:t>
-      </w:r>
-      <w:proofErr w:type="spellEnd"/>
-      <w:r>
-        <w:t xml:space="preserve"> profile page. </w:t>
-      </w:r>
-      <w:proofErr w:type="gramStart"/>
-      <w:r>
-        <w:t>User is</w:t>
-      </w:r>
-      <w:proofErr w:type="gramEnd"/>
-      <w:r>
-        <w:t xml:space="preserve"> prompted to search for sillygoose228 nickname)</w:t>
-      </w:r>
-    </w:p>
-    <w:p>
-      <w:r>
-        <w:t xml:space="preserve">God, even </w:t>
-      </w:r>
-      <w:r>
-        <w:t>h</w:t>
-      </w:r>
-      <w:r>
-        <w:t xml:space="preserve">is name is stupid. Not like mine </w:t>
-      </w:r>
-      <w:proofErr w:type="spellStart"/>
-      <w:r>
-        <w:t>tho</w:t>
-      </w:r>
-      <w:proofErr w:type="spellEnd"/>
-      <w:r>
         <w:t xml:space="preserve">. </w:t>
       </w:r>
-      <w:proofErr w:type="spellStart"/>
-      <w:r>
-        <w:t>Main_hero</w:t>
-      </w:r>
-      <w:proofErr w:type="spellEnd"/>
-      <w:r>
-        <w:t xml:space="preserve">. </w:t>
-      </w:r>
       <w:r>
         <w:t>You might not see this yet, but my nickname has at least</w:t>
       </w:r>
@@ -7161,7 +7178,6 @@
     </w:p>
     <w:p>
       <w:r>
-        <w:lastRenderedPageBreak/>
         <w:t xml:space="preserve">Ok, so, </w:t>
       </w:r>
       <w:proofErr w:type="gramStart"/>
@@ -7248,6 +7264,7 @@
     </w:p>
     <w:p>
       <w:r>
+        <w:lastRenderedPageBreak/>
         <w:t>Sillygoose</w:t>
       </w:r>
       <w:proofErr w:type="gramStart"/>
@@ -7490,37 +7507,364 @@
     </w:p>
     <w:p>
       <w:r>
+        <w:t>I FUCKED UP</w:t>
+      </w:r>
+      <w:r>
+        <w:t>.</w:t>
+      </w:r>
+    </w:p>
+    <w:p>
+      <w:r>
+        <w:t>I FORGOT TO CHANGE AN AUTHOR OF THE POST</w:t>
+      </w:r>
+      <w:r>
+        <w:t xml:space="preserve"> FROM PLACEHOLDER</w:t>
+      </w:r>
+      <w:r>
+        <w:t>.</w:t>
+      </w:r>
+    </w:p>
+    <w:p>
+      <w:r>
+        <w:t xml:space="preserve">Even </w:t>
+      </w:r>
+      <w:proofErr w:type="spellStart"/>
+      <w:proofErr w:type="gramStart"/>
+      <w:r>
+        <w:t>tho</w:t>
+      </w:r>
+      <w:proofErr w:type="spellEnd"/>
+      <w:proofErr w:type="gramEnd"/>
+      <w:r>
+        <w:t xml:space="preserve"> I got his creds already, he might realize what’s going on and change his password. I need to convince him it’s ok.</w:t>
+      </w:r>
+    </w:p>
+    <w:p>
+      <w:proofErr w:type="spellStart"/>
+      <w:r>
+        <w:t>Main_hero</w:t>
+      </w:r>
+      <w:proofErr w:type="spellEnd"/>
+      <w:r>
+        <w:t xml:space="preserve">: </w:t>
+      </w:r>
+      <w:proofErr w:type="spellStart"/>
+      <w:r>
+        <w:t>uhhh</w:t>
+      </w:r>
+      <w:proofErr w:type="spellEnd"/>
+      <w:r>
+        <w:t xml:space="preserve"> idk, this user shows as deleted to me already. Maybe The Forum admins already</w:t>
+      </w:r>
+      <w:r>
+        <w:t xml:space="preserve"> banned this guy, but website doesn’t reflect it yet.</w:t>
+      </w:r>
+    </w:p>
+    <w:p>
+      <w:proofErr w:type="spellStart"/>
+      <w:r>
+        <w:t>Main_hero</w:t>
+      </w:r>
+      <w:proofErr w:type="spellEnd"/>
+      <w:r>
+        <w:t xml:space="preserve">: </w:t>
+      </w:r>
+      <w:proofErr w:type="spellStart"/>
+      <w:r>
+        <w:t>yk</w:t>
+      </w:r>
+      <w:proofErr w:type="spellEnd"/>
+      <w:r>
+        <w:t xml:space="preserve"> the forum is </w:t>
+      </w:r>
+      <w:proofErr w:type="gramStart"/>
+      <w:r>
+        <w:t>really buggy</w:t>
+      </w:r>
+      <w:proofErr w:type="gramEnd"/>
+      <w:r>
+        <w:t xml:space="preserve"> sometimes.</w:t>
+      </w:r>
+    </w:p>
+    <w:p>
+      <w:r>
         <w:lastRenderedPageBreak/>
-        <w:t>I FUCKED UP</w:t>
+        <w:t>Sillygoose228:</w:t>
+      </w:r>
+      <w:r>
+        <w:t xml:space="preserve"> </w:t>
+      </w:r>
+      <w:r>
+        <w:t>yeah, right</w:t>
+      </w:r>
+    </w:p>
+    <w:p>
+      <w:r>
+        <w:t>Sillygoose228: strangely enough, website was lagging even more, when I was deleting that post</w:t>
+      </w:r>
+    </w:p>
+    <w:p>
+      <w:r>
+        <w:t xml:space="preserve">Fucking </w:t>
+      </w:r>
+      <w:proofErr w:type="spellStart"/>
+      <w:r>
+        <w:t>clanker</w:t>
+      </w:r>
+      <w:proofErr w:type="spellEnd"/>
+      <w:r>
+        <w:t xml:space="preserve"> gave me shit code. I specifically asked it to make code as optimized as possible </w:t>
+      </w:r>
+      <w:r>
+        <w:t>and make no mistakes</w:t>
       </w:r>
       <w:r>
         <w:t>.</w:t>
       </w:r>
-    </w:p>
-    <w:p>
-      <w:r>
-        <w:t>I FORGOT TO CHANGE AN AUTHOR OF THE POST</w:t>
-      </w:r>
-      <w:r>
-        <w:t xml:space="preserve"> FROM PLACEHOLDER</w:t>
-      </w:r>
-      <w:r>
-        <w:t>.</w:t>
-      </w:r>
-    </w:p>
-    <w:p>
-      <w:r>
-        <w:t xml:space="preserve">Even </w:t>
-      </w:r>
-      <w:proofErr w:type="spellStart"/>
+      <w:r>
+        <w:t xml:space="preserve"> </w:t>
+      </w:r>
       <w:proofErr w:type="gramStart"/>
       <w:r>
+        <w:t>Can’t</w:t>
+      </w:r>
+      <w:proofErr w:type="gramEnd"/>
+      <w:r>
+        <w:t xml:space="preserve"> trust shit these days.</w:t>
+      </w:r>
+    </w:p>
+    <w:p>
+      <w:r>
+        <w:t>(Sillygoose228 is still typing)</w:t>
+      </w:r>
+    </w:p>
+    <w:p>
+      <w:r>
+        <w:t xml:space="preserve">What is he typing for so long? Fuck, I </w:t>
+      </w:r>
+      <w:r>
+        <w:t xml:space="preserve">might be burned here. What if he is </w:t>
+      </w:r>
+      <w:proofErr w:type="spellStart"/>
+      <w:r>
+        <w:t>gonna</w:t>
+      </w:r>
+      <w:proofErr w:type="spellEnd"/>
+      <w:r>
+        <w:t xml:space="preserve"> ask me about how did I </w:t>
+      </w:r>
+      <w:proofErr w:type="gramStart"/>
+      <w:r>
+        <w:t>find</w:t>
+      </w:r>
+      <w:proofErr w:type="gramEnd"/>
+      <w:r>
+        <w:t xml:space="preserve"> this post? Or why am I reporting it even </w:t>
+      </w:r>
+      <w:proofErr w:type="spellStart"/>
+      <w:r>
         <w:t>tho</w:t>
       </w:r>
       <w:proofErr w:type="spellEnd"/>
+      <w:r>
+        <w:t xml:space="preserve"> </w:t>
+      </w:r>
+      <w:proofErr w:type="spellStart"/>
+      <w:r>
+        <w:t>im</w:t>
+      </w:r>
+      <w:proofErr w:type="spellEnd"/>
+      <w:r>
+        <w:t xml:space="preserve"> not even a follower? Shit, I </w:t>
+      </w:r>
+      <w:r>
+        <w:t xml:space="preserve">even </w:t>
+      </w:r>
+      <w:r>
+        <w:t xml:space="preserve">forgot to follow fucking </w:t>
+      </w:r>
+      <w:r>
+        <w:t>zero</w:t>
+      </w:r>
+      <w:r>
+        <w:t xml:space="preserve"> sub</w:t>
+      </w:r>
+      <w:r>
+        <w:t>! Yeah, I might be done for here.</w:t>
+      </w:r>
+    </w:p>
+    <w:p>
+      <w:r>
+        <w:t>Silligoose228: yeah, it</w:t>
+      </w:r>
+      <w:r>
+        <w:t>’s</w:t>
+      </w:r>
+      <w:r>
+        <w:t xml:space="preserve"> probably the same </w:t>
+      </w:r>
+      <w:r>
+        <w:t>as</w:t>
+      </w:r>
+      <w:r>
+        <w:t xml:space="preserve"> the replies bug. I once tried to reply to someone in the comments, I think it was some discussion in my sub and website was lagging too much and I couldn’t send my reply, but once it started working, I’ve sent like 5 replies in a row! How funny is that, huh?</w:t>
+      </w:r>
+    </w:p>
+    <w:p>
+      <w:r>
+        <w:t>…</w:t>
+      </w:r>
+      <w:proofErr w:type="spellStart"/>
+      <w:r>
+        <w:t>jesus</w:t>
+      </w:r>
+      <w:proofErr w:type="spellEnd"/>
+      <w:r>
+        <w:t xml:space="preserve"> bro </w:t>
+      </w:r>
+      <w:r>
+        <w:t>I was losing my shit here</w:t>
+      </w:r>
+      <w:r>
+        <w:t xml:space="preserve"> and he was just</w:t>
+      </w:r>
+      <w:r>
+        <w:t xml:space="preserve"> taking his time to write this</w:t>
+      </w:r>
+      <w:r>
+        <w:t>?</w:t>
+      </w:r>
+    </w:p>
+    <w:p>
+      <w:proofErr w:type="spellStart"/>
+      <w:r>
+        <w:t>Main_hero</w:t>
+      </w:r>
+      <w:proofErr w:type="spellEnd"/>
+      <w:r>
+        <w:t xml:space="preserve">: </w:t>
+      </w:r>
+      <w:r>
+        <w:t>very</w:t>
+      </w:r>
+    </w:p>
+    <w:p>
+      <w:r>
+        <w:t>Now the fun part. I need to log out and log in as him and take over the sub.</w:t>
+      </w:r>
+    </w:p>
+    <w:p>
+      <w:r>
+        <w:t>(User is prompted to log out and log in as sillygoose228)</w:t>
+      </w:r>
+    </w:p>
+    <w:p>
+      <w:r>
+        <w:t>Now I need to remove all the modes and transfer the ownership to my account.</w:t>
+      </w:r>
+    </w:p>
+    <w:p>
+      <w:r>
+        <w:t>(User is prompted to remove all the mods and transfer the ownership)</w:t>
+      </w:r>
+    </w:p>
+    <w:p>
+      <w:r>
+        <w:t xml:space="preserve">And I’m done lol. That’s it, I fucking did it! Now I </w:t>
+      </w:r>
+      <w:proofErr w:type="spellStart"/>
+      <w:r>
+        <w:t>gotta</w:t>
+      </w:r>
+      <w:proofErr w:type="spellEnd"/>
+      <w:r>
+        <w:t xml:space="preserve"> go back and tell </w:t>
+      </w:r>
+      <w:proofErr w:type="spellStart"/>
+      <w:r>
+        <w:t>cyberdivers</w:t>
+      </w:r>
+      <w:proofErr w:type="spellEnd"/>
+      <w:r>
+        <w:t xml:space="preserve"> I got the keys.</w:t>
+      </w:r>
+    </w:p>
+    <w:p>
+      <w:r>
+        <w:t>(</w:t>
+      </w:r>
+      <w:proofErr w:type="gramStart"/>
+      <w:r>
+        <w:t>User is</w:t>
+      </w:r>
       <w:proofErr w:type="gramEnd"/>
       <w:r>
-        <w:t xml:space="preserve"> I got his creds already, he might realize what’s going on and change his password. I need to convince him it’s ok.</w:t>
+        <w:t xml:space="preserve"> prompted to log out and log in as </w:t>
+      </w:r>
+      <w:proofErr w:type="spellStart"/>
+      <w:r>
+        <w:t>main_hero</w:t>
+      </w:r>
+      <w:proofErr w:type="spellEnd"/>
+      <w:r>
+        <w:t xml:space="preserve"> and go to </w:t>
+      </w:r>
+      <w:proofErr w:type="gramStart"/>
+      <w:r>
+        <w:t xml:space="preserve">the </w:t>
+      </w:r>
+      <w:proofErr w:type="spellStart"/>
+      <w:r>
+        <w:t>cyberdivers</w:t>
+      </w:r>
+      <w:proofErr w:type="spellEnd"/>
+      <w:proofErr w:type="gramEnd"/>
+      <w:r>
+        <w:t xml:space="preserve"> </w:t>
+      </w:r>
+      <w:r>
+        <w:t>chat)</w:t>
+      </w:r>
+    </w:p>
+    <w:p>
+      <w:r>
+        <w:t>(Previous messages)</w:t>
+      </w:r>
+    </w:p>
+    <w:p>
+      <w:r>
+        <w:t xml:space="preserve">User 4: bro </w:t>
+      </w:r>
+      <w:proofErr w:type="spellStart"/>
+      <w:r>
+        <w:t>ts</w:t>
+      </w:r>
+      <w:proofErr w:type="spellEnd"/>
+      <w:r>
+        <w:t xml:space="preserve"> is just too funny</w:t>
+      </w:r>
+    </w:p>
+    <w:p>
+      <w:r>
+        <w:t>User 5: can we ban this mom’s hacker bro</w:t>
+      </w:r>
+    </w:p>
+    <w:p>
+      <w:r>
+        <w:t>User 7: just stop giving attention to this clown ass</w:t>
+      </w:r>
+    </w:p>
+    <w:p>
+      <w:r>
+        <w:t xml:space="preserve">User 7: he is </w:t>
+      </w:r>
+      <w:proofErr w:type="gramStart"/>
+      <w:r>
+        <w:t>actually retarded</w:t>
+      </w:r>
+      <w:proofErr w:type="gramEnd"/>
+      <w:r>
+        <w:t xml:space="preserve"> idk </w:t>
       </w:r>
     </w:p>
     <w:p>
@@ -7530,555 +7874,227 @@
       </w:r>
       <w:proofErr w:type="spellEnd"/>
       <w:r>
-        <w:t xml:space="preserve">: </w:t>
-      </w:r>
-      <w:proofErr w:type="spellStart"/>
-      <w:r>
-        <w:t>uhhh</w:t>
-      </w:r>
-      <w:proofErr w:type="spellEnd"/>
-      <w:r>
-        <w:t xml:space="preserve"> idk, this user shows as deleted to me already. Maybe The Forum admins already</w:t>
-      </w:r>
-      <w:r>
-        <w:t xml:space="preserve"> banned this guy, but website doesn’t reflect it yet.</w:t>
-      </w:r>
-    </w:p>
-    <w:p>
-      <w:proofErr w:type="spellStart"/>
-      <w:r>
+        <w:t xml:space="preserve">: I hacked the </w:t>
+      </w:r>
+      <w:r>
+        <w:t>zero</w:t>
+      </w:r>
+      <w:r>
+        <w:t xml:space="preserve"> sub</w:t>
+      </w:r>
+    </w:p>
+    <w:p>
+      <w:proofErr w:type="spellStart"/>
+      <w:r>
+        <w:lastRenderedPageBreak/>
         <w:t>Main_hero</w:t>
       </w:r>
       <w:proofErr w:type="spellEnd"/>
       <w:r>
-        <w:t xml:space="preserve">: </w:t>
-      </w:r>
-      <w:proofErr w:type="spellStart"/>
-      <w:r>
-        <w:t>yk</w:t>
-      </w:r>
-      <w:proofErr w:type="spellEnd"/>
-      <w:r>
-        <w:t xml:space="preserve"> the forum is </w:t>
+        <w:t>: check the admins</w:t>
+      </w:r>
+    </w:p>
+    <w:p>
+      <w:pPr>
+        <w:pStyle w:val="Heading3"/>
+      </w:pPr>
+      <w:bookmarkStart w:id="20" w:name="_Toc216793256"/>
+      <w:r>
+        <w:t>Aftermath</w:t>
+      </w:r>
+      <w:bookmarkEnd w:id="20"/>
+    </w:p>
+    <w:p>
+      <w:r>
+        <w:t>User 1: what the fuck</w:t>
+      </w:r>
+    </w:p>
+    <w:p>
+      <w:r>
+        <w:t>User 2: no fucking way</w:t>
+      </w:r>
+    </w:p>
+    <w:p>
+      <w:r>
+        <w:t xml:space="preserve">User 3: </w:t>
       </w:r>
       <w:proofErr w:type="gramStart"/>
       <w:r>
-        <w:t>really buggy</w:t>
+        <w:t>no</w:t>
       </w:r>
       <w:proofErr w:type="gramEnd"/>
       <w:r>
-        <w:t xml:space="preserve"> sometimes.</w:t>
-      </w:r>
-    </w:p>
-    <w:p>
-      <w:r>
-        <w:t>Sillygoose228:</w:t>
+        <w:t xml:space="preserve"> way</w:t>
+      </w:r>
+    </w:p>
+    <w:p>
+      <w:r>
+        <w:t>User 4: you</w:t>
+      </w:r>
+      <w:r>
+        <w:t>’re</w:t>
+      </w:r>
+      <w:r>
+        <w:t xml:space="preserve"> crazy son of a </w:t>
+      </w:r>
+      <w:proofErr w:type="gramStart"/>
+      <w:r>
+        <w:t>bitch,</w:t>
+      </w:r>
+      <w:proofErr w:type="gramEnd"/>
+      <w:r>
+        <w:t xml:space="preserve"> you </w:t>
+      </w:r>
+      <w:proofErr w:type="gramStart"/>
+      <w:r>
+        <w:t>actually did</w:t>
+      </w:r>
+      <w:proofErr w:type="gramEnd"/>
+      <w:r>
+        <w:t xml:space="preserve"> it</w:t>
+      </w:r>
+    </w:p>
+    <w:p>
+      <w:r>
+        <w:t>User 5: what the fuck? How</w:t>
+      </w:r>
+    </w:p>
+    <w:p>
+      <w:r>
+        <w:t>User 6: fucking legend</w:t>
+      </w:r>
+    </w:p>
+    <w:p>
+      <w:r>
+        <w:t>User 7: lmao what</w:t>
+      </w:r>
+    </w:p>
+    <w:p>
+      <w:r>
+        <w:t xml:space="preserve">User 8: of all people it’s </w:t>
+      </w:r>
+      <w:proofErr w:type="spellStart"/>
+      <w:r>
+        <w:t>main_hero</w:t>
+      </w:r>
+      <w:proofErr w:type="spellEnd"/>
+      <w:r>
+        <w:t xml:space="preserve"> who did that </w:t>
+      </w:r>
+      <w:proofErr w:type="spellStart"/>
+      <w:r>
+        <w:t>lmaooo</w:t>
+      </w:r>
+      <w:proofErr w:type="spellEnd"/>
+    </w:p>
+    <w:p>
+      <w:proofErr w:type="spellStart"/>
+      <w:r>
+        <w:t>Main_hero</w:t>
+      </w:r>
+      <w:proofErr w:type="spellEnd"/>
+      <w:r>
+        <w:t>: fuck yeah, it was me</w:t>
+      </w:r>
+    </w:p>
+    <w:p>
+      <w:proofErr w:type="spellStart"/>
+      <w:r>
+        <w:t>Main_</w:t>
+      </w:r>
+      <w:proofErr w:type="gramStart"/>
+      <w:r>
+        <w:t>hero</w:t>
+      </w:r>
+      <w:proofErr w:type="spellEnd"/>
+      <w:r>
+        <w:t>:</w:t>
+      </w:r>
+      <w:proofErr w:type="gramEnd"/>
+      <w:r>
+        <w:t xml:space="preserve"> let’s spam whatever we want on this sub, we can do it now</w:t>
+      </w:r>
+    </w:p>
+    <w:p>
+      <w:r>
+        <w:t>User 5: fuck yeah, let’s do it</w:t>
+      </w:r>
+    </w:p>
+    <w:p>
+      <w:r>
+        <w:t xml:space="preserve">User 6: </w:t>
+      </w:r>
+      <w:proofErr w:type="spellStart"/>
+      <w:r>
+        <w:t>omw</w:t>
+      </w:r>
+      <w:proofErr w:type="spellEnd"/>
+    </w:p>
+    <w:p>
+      <w:r>
+        <w:t>User 9: how the fuck did u do that</w:t>
+      </w:r>
+    </w:p>
+    <w:p>
+      <w:r>
+        <w:t xml:space="preserve">User 7: </w:t>
+      </w:r>
+      <w:proofErr w:type="spellStart"/>
+      <w:r>
+        <w:t>alr</w:t>
+      </w:r>
+      <w:proofErr w:type="spellEnd"/>
+      <w:r>
+        <w:t xml:space="preserve"> why not</w:t>
+      </w:r>
+    </w:p>
+    <w:p>
+      <w:r>
+        <w:t xml:space="preserve">User 9: </w:t>
+      </w:r>
+      <w:proofErr w:type="gramStart"/>
+      <w:r>
+        <w:t>hell</w:t>
+      </w:r>
+      <w:proofErr w:type="gramEnd"/>
+      <w:r>
+        <w:t xml:space="preserve"> yeah lmao</w:t>
+      </w:r>
+    </w:p>
+    <w:p>
+      <w:r>
+        <w:t>Let me check the zero sub now</w:t>
+      </w:r>
+    </w:p>
+    <w:p>
+      <w:r>
+        <w:t>(</w:t>
+      </w:r>
+      <w:proofErr w:type="gramStart"/>
+      <w:r>
+        <w:t>User is</w:t>
+      </w:r>
+      <w:proofErr w:type="gramEnd"/>
+      <w:r>
+        <w:t xml:space="preserve"> prompted to search for </w:t>
+      </w:r>
+      <w:r>
+        <w:t>zero</w:t>
       </w:r>
       <w:r>
         <w:t xml:space="preserve"> </w:t>
       </w:r>
-      <w:r>
-        <w:t>yeah, right</w:t>
-      </w:r>
-    </w:p>
-    <w:p>
-      <w:r>
-        <w:t>Sillygoose228: strangely enough, website was lagging even more, when I was deleting that post</w:t>
-      </w:r>
-    </w:p>
-    <w:p>
-      <w:r>
-        <w:t xml:space="preserve">Fucking </w:t>
-      </w:r>
-      <w:proofErr w:type="spellStart"/>
-      <w:r>
-        <w:t>clanker</w:t>
-      </w:r>
-      <w:proofErr w:type="spellEnd"/>
-      <w:r>
-        <w:t xml:space="preserve"> gave me shit code. I specifically asked it to make code as optimized as possible </w:t>
-      </w:r>
-      <w:r>
-        <w:t>and make no mistakes</w:t>
-      </w:r>
-      <w:r>
-        <w:t>.</w:t>
-      </w:r>
-      <w:r>
-        <w:t xml:space="preserve"> </w:t>
-      </w:r>
       <w:proofErr w:type="gramStart"/>
       <w:r>
-        <w:t>Can’t</w:t>
+        <w:t>sub</w:t>
       </w:r>
       <w:proofErr w:type="gramEnd"/>
       <w:r>
-        <w:t xml:space="preserve"> trust shit these days.</w:t>
-      </w:r>
-    </w:p>
-    <w:p>
-      <w:r>
-        <w:t>(Sillygoose228 is still typing)</w:t>
-      </w:r>
-    </w:p>
-    <w:p>
-      <w:r>
-        <w:t xml:space="preserve">What is he typing for so long? Fuck, I </w:t>
-      </w:r>
-      <w:r>
-        <w:t xml:space="preserve">might be burned here. What if he is </w:t>
-      </w:r>
-      <w:proofErr w:type="spellStart"/>
-      <w:r>
-        <w:t>gonna</w:t>
-      </w:r>
-      <w:proofErr w:type="spellEnd"/>
-      <w:r>
-        <w:t xml:space="preserve"> ask me about how did I </w:t>
-      </w:r>
-      <w:proofErr w:type="gramStart"/>
-      <w:r>
-        <w:t>find</w:t>
-      </w:r>
-      <w:proofErr w:type="gramEnd"/>
-      <w:r>
-        <w:t xml:space="preserve"> this post? Or why am I reporting it even </w:t>
-      </w:r>
-      <w:proofErr w:type="spellStart"/>
-      <w:r>
-        <w:t>tho</w:t>
-      </w:r>
-      <w:proofErr w:type="spellEnd"/>
-      <w:r>
-        <w:t xml:space="preserve"> </w:t>
-      </w:r>
-      <w:proofErr w:type="spellStart"/>
-      <w:r>
-        <w:t>im</w:t>
-      </w:r>
-      <w:proofErr w:type="spellEnd"/>
-      <w:r>
-        <w:t xml:space="preserve"> not even a follower? Shit, I </w:t>
-      </w:r>
-      <w:r>
-        <w:t xml:space="preserve">even </w:t>
-      </w:r>
-      <w:r>
-        <w:t xml:space="preserve">forgot to follow fucking </w:t>
-      </w:r>
-      <w:r>
-        <w:t>zero</w:t>
-      </w:r>
-      <w:r>
-        <w:t xml:space="preserve"> sub</w:t>
-      </w:r>
-      <w:r>
-        <w:t>! Yeah, I might be done for here.</w:t>
-      </w:r>
-    </w:p>
-    <w:p>
-      <w:r>
-        <w:t>Silligoose228: yeah, it</w:t>
-      </w:r>
-      <w:r>
-        <w:t>’s</w:t>
-      </w:r>
-      <w:r>
-        <w:t xml:space="preserve"> probably the same </w:t>
-      </w:r>
-      <w:r>
-        <w:t>as</w:t>
-      </w:r>
-      <w:r>
-        <w:t xml:space="preserve"> the replies bug. I once tried to reply to someone in the comments, I think it was some discussion in my sub and website was lagging too much and I couldn’t send my reply, but once it started working, I’ve sent like 5 replies in a row! How funny is that, huh?</w:t>
-      </w:r>
-    </w:p>
-    <w:p>
-      <w:r>
-        <w:t>…</w:t>
-      </w:r>
-      <w:proofErr w:type="spellStart"/>
-      <w:r>
-        <w:t>jesus</w:t>
-      </w:r>
-      <w:proofErr w:type="spellEnd"/>
-      <w:r>
-        <w:t xml:space="preserve"> bro </w:t>
-      </w:r>
-      <w:r>
-        <w:t>I was losing my shit here</w:t>
-      </w:r>
-      <w:r>
-        <w:t xml:space="preserve"> and he was just</w:t>
-      </w:r>
-      <w:r>
-        <w:t xml:space="preserve"> taking his time to write this</w:t>
-      </w:r>
-      <w:r>
-        <w:t>?</w:t>
-      </w:r>
-    </w:p>
-    <w:p>
-      <w:proofErr w:type="spellStart"/>
-      <w:r>
-        <w:t>Main_hero</w:t>
-      </w:r>
-      <w:proofErr w:type="spellEnd"/>
-      <w:r>
-        <w:t xml:space="preserve">: </w:t>
-      </w:r>
-      <w:r>
-        <w:t>very</w:t>
-      </w:r>
-    </w:p>
-    <w:p>
-      <w:r>
-        <w:t>Now the fun part. I need to log out and log in as him and take over the sub.</w:t>
-      </w:r>
-    </w:p>
-    <w:p>
-      <w:r>
-        <w:t>(User is prompted to log out and log in as sillygoose228)</w:t>
-      </w:r>
-    </w:p>
-    <w:p>
-      <w:r>
-        <w:t>Now I need to remove all the modes and transfer the ownership to my account.</w:t>
-      </w:r>
-    </w:p>
-    <w:p>
-      <w:r>
-        <w:t>(User is prompted to remove all the mods and transfer the ownership)</w:t>
-      </w:r>
-    </w:p>
-    <w:p>
-      <w:r>
-        <w:t xml:space="preserve">And I’m done lol. That’s it, I fucking did it! Now I </w:t>
-      </w:r>
-      <w:proofErr w:type="spellStart"/>
-      <w:r>
-        <w:t>gotta</w:t>
-      </w:r>
-      <w:proofErr w:type="spellEnd"/>
-      <w:r>
-        <w:t xml:space="preserve"> go back and tell </w:t>
-      </w:r>
-      <w:proofErr w:type="spellStart"/>
-      <w:r>
-        <w:t>cyberdivers</w:t>
-      </w:r>
-      <w:proofErr w:type="spellEnd"/>
-      <w:r>
-        <w:t xml:space="preserve"> I got the keys.</w:t>
-      </w:r>
-    </w:p>
-    <w:p>
-      <w:r>
-        <w:t>(</w:t>
-      </w:r>
-      <w:proofErr w:type="gramStart"/>
-      <w:r>
-        <w:t>User is</w:t>
-      </w:r>
-      <w:proofErr w:type="gramEnd"/>
-      <w:r>
-        <w:t xml:space="preserve"> prompted to log out and log in as </w:t>
-      </w:r>
-      <w:proofErr w:type="spellStart"/>
-      <w:r>
-        <w:t>main_hero</w:t>
-      </w:r>
-      <w:proofErr w:type="spellEnd"/>
-      <w:r>
-        <w:t xml:space="preserve"> and go to </w:t>
-      </w:r>
-      <w:proofErr w:type="gramStart"/>
-      <w:r>
-        <w:t xml:space="preserve">the </w:t>
-      </w:r>
-      <w:proofErr w:type="spellStart"/>
-      <w:r>
-        <w:t>cyberdivers</w:t>
-      </w:r>
-      <w:proofErr w:type="spellEnd"/>
-      <w:proofErr w:type="gramEnd"/>
-      <w:r>
-        <w:t xml:space="preserve"> </w:t>
-      </w:r>
-      <w:r>
-        <w:t>chat)</w:t>
-      </w:r>
-    </w:p>
-    <w:p>
-      <w:r>
-        <w:lastRenderedPageBreak/>
-        <w:t>(Previous messages)</w:t>
-      </w:r>
-    </w:p>
-    <w:p>
-      <w:r>
-        <w:t xml:space="preserve">User 4: bro </w:t>
-      </w:r>
-      <w:proofErr w:type="spellStart"/>
-      <w:r>
-        <w:t>ts</w:t>
-      </w:r>
-      <w:proofErr w:type="spellEnd"/>
-      <w:r>
-        <w:t xml:space="preserve"> is just too funny</w:t>
-      </w:r>
-    </w:p>
-    <w:p>
-      <w:r>
-        <w:t>User 5: can we ban this mom’s hacker bro</w:t>
-      </w:r>
-    </w:p>
-    <w:p>
-      <w:r>
-        <w:t>User 7: just stop giving attention to this clown ass</w:t>
-      </w:r>
-    </w:p>
-    <w:p>
-      <w:r>
-        <w:t xml:space="preserve">User 7: he is </w:t>
-      </w:r>
-      <w:proofErr w:type="gramStart"/>
-      <w:r>
-        <w:t>actually retarded</w:t>
-      </w:r>
-      <w:proofErr w:type="gramEnd"/>
-      <w:r>
-        <w:t xml:space="preserve"> idk </w:t>
-      </w:r>
-    </w:p>
-    <w:p>
-      <w:proofErr w:type="spellStart"/>
-      <w:r>
-        <w:t>Main_hero</w:t>
-      </w:r>
-      <w:proofErr w:type="spellEnd"/>
-      <w:r>
-        <w:t xml:space="preserve">: I hacked the </w:t>
-      </w:r>
-      <w:r>
-        <w:t>zero</w:t>
-      </w:r>
-      <w:r>
-        <w:t xml:space="preserve"> sub</w:t>
-      </w:r>
-    </w:p>
-    <w:p>
-      <w:proofErr w:type="spellStart"/>
-      <w:r>
-        <w:t>Main_hero</w:t>
-      </w:r>
-      <w:proofErr w:type="spellEnd"/>
-      <w:r>
-        <w:t>: check the admins</w:t>
-      </w:r>
-    </w:p>
-    <w:p>
-      <w:pPr>
-        <w:pStyle w:val="Heading3"/>
-      </w:pPr>
-      <w:bookmarkStart w:id="20" w:name="_Toc216793256"/>
-      <w:r>
-        <w:t>Aftermath</w:t>
-      </w:r>
-      <w:bookmarkEnd w:id="20"/>
-    </w:p>
-    <w:p>
-      <w:r>
-        <w:t>User 1: what the fuck</w:t>
-      </w:r>
-    </w:p>
-    <w:p>
-      <w:r>
-        <w:t>User 2: no fucking way</w:t>
-      </w:r>
-    </w:p>
-    <w:p>
-      <w:r>
-        <w:t xml:space="preserve">User 3: </w:t>
-      </w:r>
-      <w:proofErr w:type="gramStart"/>
-      <w:r>
-        <w:t>no</w:t>
-      </w:r>
-      <w:proofErr w:type="gramEnd"/>
-      <w:r>
-        <w:t xml:space="preserve"> way</w:t>
-      </w:r>
-    </w:p>
-    <w:p>
-      <w:r>
-        <w:t>User 4: you</w:t>
-      </w:r>
-      <w:r>
-        <w:t>’re</w:t>
-      </w:r>
-      <w:r>
-        <w:t xml:space="preserve"> crazy son of a </w:t>
-      </w:r>
-      <w:proofErr w:type="gramStart"/>
-      <w:r>
-        <w:t>bitch,</w:t>
-      </w:r>
-      <w:proofErr w:type="gramEnd"/>
-      <w:r>
-        <w:t xml:space="preserve"> you </w:t>
-      </w:r>
-      <w:proofErr w:type="gramStart"/>
-      <w:r>
-        <w:t>actually did</w:t>
-      </w:r>
-      <w:proofErr w:type="gramEnd"/>
-      <w:r>
-        <w:t xml:space="preserve"> it</w:t>
-      </w:r>
-    </w:p>
-    <w:p>
-      <w:r>
-        <w:t>User 5: what the fuck? How</w:t>
-      </w:r>
-    </w:p>
-    <w:p>
-      <w:r>
-        <w:t>User 6: fucking legend</w:t>
-      </w:r>
-    </w:p>
-    <w:p>
-      <w:r>
-        <w:t>User 7: lmao what</w:t>
-      </w:r>
-    </w:p>
-    <w:p>
-      <w:r>
-        <w:t xml:space="preserve">User 8: of all people it’s </w:t>
-      </w:r>
-      <w:proofErr w:type="spellStart"/>
-      <w:r>
-        <w:t>main_hero</w:t>
-      </w:r>
-      <w:proofErr w:type="spellEnd"/>
-      <w:r>
-        <w:t xml:space="preserve"> who did that </w:t>
-      </w:r>
-      <w:proofErr w:type="spellStart"/>
-      <w:r>
-        <w:t>lmaooo</w:t>
-      </w:r>
-      <w:proofErr w:type="spellEnd"/>
-    </w:p>
-    <w:p>
-      <w:proofErr w:type="spellStart"/>
-      <w:r>
-        <w:t>Main_hero</w:t>
-      </w:r>
-      <w:proofErr w:type="spellEnd"/>
-      <w:r>
-        <w:t>: fuck yeah, it was me</w:t>
-      </w:r>
-    </w:p>
-    <w:p>
-      <w:proofErr w:type="spellStart"/>
-      <w:r>
-        <w:t>Main_</w:t>
-      </w:r>
-      <w:proofErr w:type="gramStart"/>
-      <w:r>
-        <w:t>hero</w:t>
-      </w:r>
-      <w:proofErr w:type="spellEnd"/>
-      <w:r>
-        <w:t>:</w:t>
-      </w:r>
-      <w:proofErr w:type="gramEnd"/>
-      <w:r>
-        <w:t xml:space="preserve"> let’s spam whatever we want on this sub, we can do it now</w:t>
-      </w:r>
-    </w:p>
-    <w:p>
-      <w:r>
-        <w:t>User 5: fuck yeah, let’s do it</w:t>
-      </w:r>
-    </w:p>
-    <w:p>
-      <w:r>
-        <w:t xml:space="preserve">User 6: </w:t>
-      </w:r>
-      <w:proofErr w:type="spellStart"/>
-      <w:r>
-        <w:t>omw</w:t>
-      </w:r>
-      <w:proofErr w:type="spellEnd"/>
-    </w:p>
-    <w:p>
-      <w:r>
-        <w:t>User 9: how the fuck did u do that</w:t>
-      </w:r>
-    </w:p>
-    <w:p>
-      <w:r>
-        <w:t xml:space="preserve">User 7: </w:t>
-      </w:r>
-      <w:proofErr w:type="spellStart"/>
-      <w:r>
-        <w:t>alr</w:t>
-      </w:r>
-      <w:proofErr w:type="spellEnd"/>
-      <w:r>
-        <w:t xml:space="preserve"> why not</w:t>
-      </w:r>
-    </w:p>
-    <w:p>
-      <w:r>
-        <w:t xml:space="preserve">User 9: </w:t>
-      </w:r>
-      <w:proofErr w:type="gramStart"/>
-      <w:r>
-        <w:t>hell</w:t>
-      </w:r>
-      <w:proofErr w:type="gramEnd"/>
-      <w:r>
-        <w:t xml:space="preserve"> yeah lmao</w:t>
-      </w:r>
-    </w:p>
-    <w:p>
-      <w:r>
-        <w:t>Let me check the zero sub now</w:t>
-      </w:r>
-    </w:p>
-    <w:p>
-      <w:r>
-        <w:t>(</w:t>
-      </w:r>
-      <w:proofErr w:type="gramStart"/>
-      <w:r>
-        <w:t>User is</w:t>
-      </w:r>
-      <w:proofErr w:type="gramEnd"/>
-      <w:r>
-        <w:t xml:space="preserve"> prompted to search for </w:t>
-      </w:r>
-      <w:r>
-        <w:t>zero</w:t>
-      </w:r>
-      <w:r>
-        <w:t xml:space="preserve"> </w:t>
-      </w:r>
-      <w:proofErr w:type="gramStart"/>
-      <w:r>
-        <w:t>sub</w:t>
-      </w:r>
-      <w:proofErr w:type="gramEnd"/>
-      <w:r>
         <w:t xml:space="preserve"> and go there)</w:t>
       </w:r>
     </w:p>
     <w:p>
       <w:r>
-        <w:lastRenderedPageBreak/>
         <w:t xml:space="preserve">Yeah, look at this. These are fruits of my </w:t>
       </w:r>
       <w:proofErr w:type="gramStart"/>
@@ -8159,6 +8175,7 @@
     </w:p>
     <w:p>
       <w:r>
+        <w:lastRenderedPageBreak/>
         <w:t>User 13: yea 100%</w:t>
       </w:r>
     </w:p>
@@ -8392,94 +8409,97 @@
     </w:p>
     <w:p>
       <w:r>
+        <w:t xml:space="preserve">User </w:t>
+      </w:r>
+      <w:r>
+        <w:t>1</w:t>
+      </w:r>
+      <w:r>
+        <w:t>3: fuck u</w:t>
+      </w:r>
+    </w:p>
+    <w:p>
+      <w:proofErr w:type="spellStart"/>
+      <w:r>
+        <w:t>Main_hero</w:t>
+      </w:r>
+      <w:proofErr w:type="spellEnd"/>
+      <w:r>
+        <w:t>: fuck u</w:t>
+      </w:r>
+    </w:p>
+    <w:p>
+      <w:r>
+        <w:t>User 12: fuck u</w:t>
+      </w:r>
+    </w:p>
+    <w:p>
+      <w:r>
+        <w:t>User 13:</w:t>
+      </w:r>
+      <w:r>
+        <w:t xml:space="preserve"> </w:t>
+      </w:r>
+      <w:r>
+        <w:t>fuck u</w:t>
+      </w:r>
+    </w:p>
+    <w:p>
+      <w:r>
+        <w:t>(Screen slowly goes red and blurry, and then suddenly white)</w:t>
+      </w:r>
+    </w:p>
+    <w:p>
+      <w:r>
+        <w:t>Man, this shit is fucking stupid.</w:t>
+      </w:r>
+      <w:r>
+        <w:t xml:space="preserve"> The fuck am I even doing?</w:t>
+      </w:r>
+      <w:r>
+        <w:t xml:space="preserve"> I’ve s</w:t>
+      </w:r>
+      <w:r>
+        <w:t>unk</w:t>
+      </w:r>
+      <w:r>
+        <w:t xml:space="preserve"> 1000h playing </w:t>
+      </w:r>
+      <w:proofErr w:type="spellStart"/>
+      <w:r>
+        <w:t>cyberdivers</w:t>
+      </w:r>
+      <w:proofErr w:type="spellEnd"/>
+      <w:r>
+        <w:t xml:space="preserve"> </w:t>
+      </w:r>
+      <w:r>
+        <w:t xml:space="preserve">instead of doing something useful, I’ve hacked sillygoose228 and </w:t>
+      </w:r>
+      <w:r>
+        <w:t>zero</w:t>
+      </w:r>
+      <w:r>
+        <w:t xml:space="preserve"> sub even though they did nothing </w:t>
+      </w:r>
+      <w:r>
+        <w:t>but show love for one another</w:t>
+      </w:r>
+      <w:r>
+        <w:t xml:space="preserve"> and </w:t>
+      </w:r>
+      <w:r>
+        <w:t>why</w:t>
+      </w:r>
+      <w:r>
+        <w:t xml:space="preserve">? </w:t>
+      </w:r>
+      <w:r>
+        <w:t xml:space="preserve">Because I just envied </w:t>
+      </w:r>
+      <w:r>
         <w:lastRenderedPageBreak/>
-        <w:t xml:space="preserve">User </w:t>
-      </w:r>
-      <w:r>
-        <w:t>1</w:t>
-      </w:r>
-      <w:r>
-        <w:t>3: fuck u</w:t>
-      </w:r>
-    </w:p>
-    <w:p>
-      <w:proofErr w:type="spellStart"/>
-      <w:r>
-        <w:t>Main_hero</w:t>
-      </w:r>
-      <w:proofErr w:type="spellEnd"/>
-      <w:r>
-        <w:t>: fuck u</w:t>
-      </w:r>
-    </w:p>
-    <w:p>
-      <w:r>
-        <w:t>User 12: fuck u</w:t>
-      </w:r>
-    </w:p>
-    <w:p>
-      <w:r>
-        <w:t>User 13:</w:t>
-      </w:r>
-      <w:r>
-        <w:t xml:space="preserve"> </w:t>
-      </w:r>
-      <w:r>
-        <w:t>fuck u</w:t>
-      </w:r>
-    </w:p>
-    <w:p>
-      <w:r>
-        <w:t>(Screen slowly goes red and blurry, and then suddenly white)</w:t>
-      </w:r>
-    </w:p>
-    <w:p>
-      <w:r>
-        <w:t>Man, this shit is fucking stupid.</w:t>
-      </w:r>
-      <w:r>
-        <w:t xml:space="preserve"> The fuck am I even doing?</w:t>
-      </w:r>
-      <w:r>
-        <w:t xml:space="preserve"> I’ve s</w:t>
-      </w:r>
-      <w:r>
-        <w:t>unk</w:t>
-      </w:r>
-      <w:r>
-        <w:t xml:space="preserve"> 1000h playing </w:t>
-      </w:r>
-      <w:proofErr w:type="spellStart"/>
-      <w:r>
-        <w:t>cyberdivers</w:t>
-      </w:r>
-      <w:proofErr w:type="spellEnd"/>
-      <w:r>
-        <w:t xml:space="preserve"> </w:t>
-      </w:r>
-      <w:r>
-        <w:t xml:space="preserve">instead of doing something useful, I’ve hacked sillygoose228 and </w:t>
-      </w:r>
-      <w:r>
-        <w:t>zero</w:t>
-      </w:r>
-      <w:r>
-        <w:t xml:space="preserve"> sub even though they did nothing </w:t>
-      </w:r>
-      <w:r>
-        <w:t>but show love for one another</w:t>
-      </w:r>
-      <w:r>
-        <w:t xml:space="preserve"> and </w:t>
-      </w:r>
-      <w:r>
-        <w:t>why</w:t>
-      </w:r>
-      <w:r>
-        <w:t xml:space="preserve">? </w:t>
-      </w:r>
-      <w:r>
-        <w:t>Because I just envied them and I wanted</w:t>
+        <w:t>them and I wanted</w:t>
       </w:r>
       <w:r>
         <w:t xml:space="preserve"> fucking validation from my “friends”. M</w:t>

</xml_diff>

<commit_message>
started working on chats
</commit_message>
<xml_diff>
--- a/docs/Script.docx
+++ b/docs/Script.docx
@@ -1468,45 +1468,6 @@
         </w:numPr>
       </w:pPr>
       <w:r>
-        <w:t xml:space="preserve">Maybe move from sc2 to like bf or </w:t>
-      </w:r>
-      <w:proofErr w:type="spellStart"/>
-      <w:r>
-        <w:t>pubg</w:t>
-      </w:r>
-      <w:proofErr w:type="spellEnd"/>
-      <w:r>
-        <w:t xml:space="preserve"> or </w:t>
-      </w:r>
-      <w:proofErr w:type="spellStart"/>
-      <w:r>
-        <w:t>smth</w:t>
-      </w:r>
-      <w:proofErr w:type="spellEnd"/>
-      <w:r>
-        <w:t xml:space="preserve"> u </w:t>
-      </w:r>
-      <w:proofErr w:type="gramStart"/>
-      <w:r>
-        <w:t>actually familiar</w:t>
-      </w:r>
-      <w:proofErr w:type="gramEnd"/>
-      <w:r>
-        <w:t xml:space="preserve"> with</w:t>
-      </w:r>
-      <w:r>
-        <w:t>, helldivers?</w:t>
-      </w:r>
-    </w:p>
-    <w:p>
-      <w:pPr>
-        <w:pStyle w:val="ListParagraph"/>
-        <w:numPr>
-          <w:ilvl w:val="0"/>
-          <w:numId w:val="33"/>
-        </w:numPr>
-      </w:pPr>
-      <w:r>
         <w:t xml:space="preserve">Intro still </w:t>
       </w:r>
       <w:proofErr w:type="spellStart"/>
@@ -1549,7 +1510,6 @@
         </w:numPr>
       </w:pPr>
       <w:r>
-        <w:lastRenderedPageBreak/>
         <w:t>Social network</w:t>
       </w:r>
       <w:r>
@@ -1568,6 +1528,7 @@
         </w:numPr>
       </w:pPr>
       <w:r>
+        <w:lastRenderedPageBreak/>
         <w:t>Echo chamber effect</w:t>
       </w:r>
     </w:p>
@@ -2013,7 +1974,6 @@
         </w:numPr>
       </w:pPr>
       <w:r>
-        <w:lastRenderedPageBreak/>
         <w:t>Gamer</w:t>
       </w:r>
     </w:p>
@@ -2027,6 +1987,7 @@
       </w:pPr>
       <w:proofErr w:type="gramStart"/>
       <w:r>
+        <w:lastRenderedPageBreak/>
         <w:t>Knows</w:t>
       </w:r>
       <w:proofErr w:type="gramEnd"/>
@@ -5084,7 +5045,10 @@
     </w:p>
     <w:p>
       <w:r>
-        <w:t>They once challenged me to play a game with them, and I absolutely destroyed them. Even though we were in the same team.</w:t>
+        <w:t>My friends from here</w:t>
+      </w:r>
+      <w:r>
+        <w:t xml:space="preserve"> once challenged me to play a game with them, and I absolutely destroyed them. Even though we were in the same team.</w:t>
       </w:r>
       <w:r>
         <w:t xml:space="preserve"> I mean, my contribution to the game was essential</w:t>
@@ -5125,7 +5089,13 @@
         <w:t>mates</w:t>
       </w:r>
       <w:r>
-        <w:t xml:space="preserve"> will be delighted to see me.</w:t>
+        <w:t xml:space="preserve"> will </w:t>
+      </w:r>
+      <w:r>
+        <w:t>love</w:t>
+      </w:r>
+      <w:r>
+        <w:t xml:space="preserve"> to see me.</w:t>
       </w:r>
     </w:p>
     <w:p>
@@ -5237,15 +5207,7 @@
     </w:p>
     <w:p>
       <w:r>
-        <w:t xml:space="preserve">User 3: </w:t>
-      </w:r>
-      <w:proofErr w:type="gramStart"/>
-      <w:r>
-        <w:t>well</w:t>
-      </w:r>
-      <w:proofErr w:type="gramEnd"/>
-      <w:r>
-        <w:t xml:space="preserve"> idk, don’t play ai faction then, or lower the diff if u can’t take the heat</w:t>
+        <w:t>User 3: don’t play ai faction then, or lower the diff if u can’t take the heat</w:t>
       </w:r>
     </w:p>
     <w:p>

</xml_diff>

<commit_message>
added parallel execution for scriptlines
intro is done yoooo
</commit_message>
<xml_diff>
--- a/docs/Script.docx
+++ b/docs/Script.docx
@@ -5465,7 +5465,7 @@
         <w:t xml:space="preserve">They love me. I know it looks like they are </w:t>
       </w:r>
       <w:r>
-        <w:t>bullying</w:t>
+        <w:t>grilling the fuck out of</w:t>
       </w:r>
       <w:r>
         <w:t xml:space="preserve"> me and calling me bad at the game or something</w:t>
@@ -8512,7 +8512,7 @@
         <w:t>Because I just envied them and I wanted</w:t>
       </w:r>
       <w:r>
-        <w:t xml:space="preserve"> fucking validation from my “friends”. M</w:t>
+        <w:t xml:space="preserve"> fucking validation from my friends. M</w:t>
       </w:r>
       <w:r>
         <w:t xml:space="preserve">y only </w:t>

</xml_diff>

<commit_message>
terminal and vim functionality
</commit_message>
<xml_diff>
--- a/docs/Script.docx
+++ b/docs/Script.docx
@@ -1480,18 +1480,6 @@
         </w:numPr>
       </w:pPr>
       <w:r>
-        <w:t>Rework finale to the idea that main_hero was searching power to the expense of safety</w:t>
-      </w:r>
-    </w:p>
-    <w:p>
-      <w:pPr>
-        <w:pStyle w:val="ListParagraph"/>
-        <w:numPr>
-          <w:ilvl w:val="0"/>
-          <w:numId w:val="33"/>
-        </w:numPr>
-      </w:pPr>
-      <w:r>
         <w:t>More visual stuff pls</w:t>
       </w:r>
     </w:p>
@@ -1501,7 +1489,6 @@
       </w:pPr>
       <w:bookmarkStart w:id="1" w:name="_Toc231307566"/>
       <w:r>
-        <w:lastRenderedPageBreak/>
         <w:t>Themes</w:t>
       </w:r>
       <w:bookmarkEnd w:id="1"/>
@@ -1527,6 +1514,7 @@
         </w:numPr>
       </w:pPr>
       <w:r>
+        <w:lastRenderedPageBreak/>
         <w:t>Social network</w:t>
       </w:r>
       <w:r>
@@ -1920,7 +1908,6 @@
         </w:numPr>
       </w:pPr>
       <w:r>
-        <w:lastRenderedPageBreak/>
         <w:t>Insecure</w:t>
       </w:r>
     </w:p>
@@ -1957,6 +1944,7 @@
         </w:numPr>
       </w:pPr>
       <w:r>
+        <w:lastRenderedPageBreak/>
         <w:t>Gamer</w:t>
       </w:r>
     </w:p>

</xml_diff>